<commit_message>
docs: align marine form catalogue and release notes
</commit_message>
<xml_diff>
--- a/deliverables/Marine_MVP_QA_and_Deployment_Checklist.docx
+++ b/deliverables/Marine_MVP_QA_and_Deployment_Checklist.docx
@@ -4,11 +4,97 @@
   <w:body>
     <w:p>
       <w:pPr>
-        <w:pStyle w:val="Title"/>
-        <w:spacing w:after="200"/>
+        <w:keepNext/>
+        <w:spacing w:before="0" w:after="60"/>
       </w:pPr>
       <w:r>
-        <w:t>Marine Observation MVP — QA and Deployment Checklist</w:t>
+        <w:rPr>
+          <w:rFonts w:ascii="Calibri" w:hAnsi="Calibri" w:eastAsia="Calibri"/>
+          <w:b/>
+          <w:color w:val="0F6F73"/>
+          <w:sz w:val="18"/>
+        </w:rPr>
+        <w:t>TEAM 04 | MARINE OBSERVATION MVP</w:t>
+      </w:r>
+    </w:p>
+    <w:p>
+      <w:pPr>
+        <w:pStyle w:val="Title"/>
+      </w:pPr>
+      <w:r>
+        <w:t>Marine MVP QA and Deployment Checklist</w:t>
+      </w:r>
+    </w:p>
+    <w:p>
+      <w:pPr>
+        <w:spacing w:before="0" w:after="60" w:line="252" w:lineRule="auto"/>
+      </w:pPr>
+      <w:r>
+        <w:rPr>
+          <w:rFonts w:ascii="Calibri" w:hAnsi="Calibri" w:eastAsia="Calibri"/>
+          <w:b/>
+          <w:color w:val="183B56"/>
+          <w:sz w:val="19"/>
+        </w:rPr>
+        <w:t xml:space="preserve">Document control: </w:t>
+      </w:r>
+      <w:r>
+        <w:rPr>
+          <w:rFonts w:ascii="Calibri" w:hAnsi="Calibri" w:eastAsia="Calibri"/>
+          <w:color w:val="61737C"/>
+          <w:sz w:val="19"/>
+        </w:rPr>
+        <w:t>Version 1.0 | 14 August 2026 | Release evidence template</w:t>
+      </w:r>
+    </w:p>
+    <w:p>
+      <w:pPr>
+        <w:spacing w:before="0" w:after="60" w:line="252" w:lineRule="auto"/>
+      </w:pPr>
+      <w:r>
+        <w:rPr>
+          <w:rFonts w:ascii="Calibri" w:hAnsi="Calibri" w:eastAsia="Calibri"/>
+          <w:b/>
+          <w:color w:val="183B56"/>
+          <w:sz w:val="19"/>
+        </w:rPr>
+        <w:t xml:space="preserve">Audience: </w:t>
+      </w:r>
+      <w:r>
+        <w:rPr>
+          <w:rFonts w:ascii="Calibri" w:hAnsi="Calibri" w:eastAsia="Calibri"/>
+          <w:color w:val="61737C"/>
+          <w:sz w:val="19"/>
+        </w:rPr>
+        <w:t>Testers, integrators, demonstrators and release reviewers</w:t>
+      </w:r>
+    </w:p>
+    <w:p>
+      <w:pPr>
+        <w:keepLines/>
+        <w:spacing w:before="100" w:after="180" w:line="264" w:lineRule="auto"/>
+        <w:ind w:left="230" w:right="115"/>
+        <w:shd w:fill="EEF6F5"/>
+        <w:pBdr>
+          <w:left w:val="single" w:sz="14" w:space="8" w:color="0F6F73"/>
+        </w:pBdr>
+      </w:pPr>
+      <w:r>
+        <w:rPr>
+          <w:rFonts w:ascii="Calibri" w:hAnsi="Calibri" w:eastAsia="Calibri"/>
+          <w:b/>
+          <w:color w:val="243746"/>
+          <w:sz w:val="21"/>
+        </w:rPr>
+        <w:t>Safety boundary:</w:t>
+      </w:r>
+      <w:r>
+        <w:rPr>
+          <w:rFonts w:ascii="Calibri" w:hAnsi="Calibri" w:eastAsia="Calibri"/>
+          <w:color w:val="243746"/>
+          <w:sz w:val="21"/>
+        </w:rPr>
+        <w:t xml:space="preserve"> Use synthetic or public data only. This MVP is a demonstration and learning tool. It does not prove a pollution source, verify species identity, establish ecological impact, or direct environmental enforcement or official clean-up action.</w:t>
       </w:r>
     </w:p>
     <w:p>
@@ -16,20 +102,602 @@
         <w:pStyle w:val="Heading1"/>
       </w:pPr>
       <w:r>
-        <w:t>Test boundary</w:t>
+        <w:t>Test record</w:t>
       </w:r>
     </w:p>
     <w:p>
       <w:pPr>
-        <w:spacing w:after="120" w:line="259" w:lineRule="auto"/>
+        <w:spacing w:before="0" w:after="120" w:line="264" w:lineRule="auto"/>
       </w:pPr>
       <w:r>
         <w:rPr>
-          <w:rFonts w:ascii="Aptos" w:hAnsi="Aptos"/>
-          <w:color w:val="1F3742"/>
-          <w:sz w:val="21"/>
+          <w:rFonts w:ascii="Calibri" w:hAnsi="Calibri" w:eastAsia="Calibri"/>
+          <w:color w:val="243746"/>
+          <w:sz w:val="22"/>
         </w:rPr>
-        <w:t>Use the deployed Render frontend and API with synthetic/public values only. Do not enter personal information or private locations.</w:t>
+        <w:t>Complete this block for each release candidate.</w:t>
+      </w:r>
+    </w:p>
+    <w:tbl>
+      <w:tblPr>
+        <w:tblStyle w:val="TableGrid"/>
+        <w:jc w:val="left"/>
+        <w:tblLook w:firstColumn="1" w:firstRow="1" w:lastColumn="0" w:lastRow="0" w:noHBand="0" w:noVBand="1" w:val="04A0"/>
+        <w:tblW w:w="9360" w:type="dxa"/>
+        <w:tblInd w:w="120" w:type="dxa"/>
+        <w:tblLayout w:type="fixed"/>
+      </w:tblPr>
+      <w:tblGrid>
+        <w:gridCol w:w="2400"/>
+        <w:gridCol w:w="6960"/>
+      </w:tblGrid>
+      <w:tr>
+        <w:trPr>
+          <w:tblHeader w:val="true"/>
+          <w:cantSplit/>
+        </w:trPr>
+        <w:tc>
+          <w:tcPr>
+            <w:tcW w:type="dxa" w:w="2400"/>
+            <w:vAlign w:val="center"/>
+            <w:tcMar>
+              <w:top w:w="80" w:type="dxa"/>
+              <w:start w:w="120" w:type="dxa"/>
+              <w:bottom w:w="80" w:type="dxa"/>
+              <w:end w:w="120" w:type="dxa"/>
+            </w:tcMar>
+            <w:shd w:fill="183B56"/>
+          </w:tcPr>
+          <w:p>
+            <w:pPr>
+              <w:spacing w:before="0" w:after="0" w:line="252" w:lineRule="auto"/>
+            </w:pPr>
+            <w:r>
+              <w:rPr>
+                <w:b/>
+              </w:rPr>
+            </w:r>
+            <w:r>
+              <w:rPr>
+                <w:rFonts w:ascii="Calibri" w:hAnsi="Calibri" w:eastAsia="Calibri"/>
+                <w:b/>
+                <w:color w:val="FFFFFF"/>
+                <w:sz w:val="18"/>
+              </w:rPr>
+              <w:t>Field</w:t>
+            </w:r>
+          </w:p>
+        </w:tc>
+        <w:tc>
+          <w:tcPr>
+            <w:tcW w:type="dxa" w:w="6960"/>
+            <w:vAlign w:val="center"/>
+            <w:tcMar>
+              <w:top w:w="80" w:type="dxa"/>
+              <w:start w:w="120" w:type="dxa"/>
+              <w:bottom w:w="80" w:type="dxa"/>
+              <w:end w:w="120" w:type="dxa"/>
+            </w:tcMar>
+            <w:shd w:fill="183B56"/>
+          </w:tcPr>
+          <w:p>
+            <w:pPr>
+              <w:spacing w:before="0" w:after="0" w:line="252" w:lineRule="auto"/>
+            </w:pPr>
+            <w:r>
+              <w:rPr>
+                <w:b/>
+              </w:rPr>
+            </w:r>
+            <w:r>
+              <w:rPr>
+                <w:rFonts w:ascii="Calibri" w:hAnsi="Calibri" w:eastAsia="Calibri"/>
+                <w:b/>
+                <w:color w:val="FFFFFF"/>
+                <w:sz w:val="18"/>
+              </w:rPr>
+              <w:t>Evidence</w:t>
+            </w:r>
+          </w:p>
+        </w:tc>
+      </w:tr>
+      <w:tr>
+        <w:trPr>
+          <w:cantSplit/>
+        </w:trPr>
+        <w:tc>
+          <w:tcPr>
+            <w:tcW w:type="dxa" w:w="2400"/>
+            <w:vAlign w:val="center"/>
+            <w:tcMar>
+              <w:top w:w="80" w:type="dxa"/>
+              <w:start w:w="120" w:type="dxa"/>
+              <w:bottom w:w="80" w:type="dxa"/>
+              <w:end w:w="120" w:type="dxa"/>
+            </w:tcMar>
+            <w:shd w:fill="EFF3F7"/>
+          </w:tcPr>
+          <w:p>
+            <w:pPr>
+              <w:spacing w:before="0" w:after="0" w:line="252" w:lineRule="auto"/>
+            </w:pPr>
+            <w:r/>
+            <w:r>
+              <w:rPr>
+                <w:rFonts w:ascii="Calibri" w:hAnsi="Calibri" w:eastAsia="Calibri"/>
+                <w:color w:val="243746"/>
+                <w:sz w:val="18"/>
+              </w:rPr>
+              <w:t>Test date and time</w:t>
+            </w:r>
+          </w:p>
+        </w:tc>
+        <w:tc>
+          <w:tcPr>
+            <w:tcW w:type="dxa" w:w="6960"/>
+            <w:vAlign w:val="center"/>
+            <w:tcMar>
+              <w:top w:w="80" w:type="dxa"/>
+              <w:start w:w="120" w:type="dxa"/>
+              <w:bottom w:w="80" w:type="dxa"/>
+              <w:end w:w="120" w:type="dxa"/>
+            </w:tcMar>
+            <w:shd w:fill="EFF3F7"/>
+          </w:tcPr>
+          <w:p>
+            <w:pPr>
+              <w:spacing w:before="0" w:after="0" w:line="252" w:lineRule="auto"/>
+            </w:pPr>
+            <w:r/>
+          </w:p>
+        </w:tc>
+      </w:tr>
+      <w:tr>
+        <w:trPr>
+          <w:cantSplit/>
+        </w:trPr>
+        <w:tc>
+          <w:tcPr>
+            <w:tcW w:type="dxa" w:w="2400"/>
+            <w:vAlign w:val="center"/>
+            <w:tcMar>
+              <w:top w:w="80" w:type="dxa"/>
+              <w:start w:w="120" w:type="dxa"/>
+              <w:bottom w:w="80" w:type="dxa"/>
+              <w:end w:w="120" w:type="dxa"/>
+            </w:tcMar>
+          </w:tcPr>
+          <w:p>
+            <w:pPr>
+              <w:spacing w:before="0" w:after="0" w:line="252" w:lineRule="auto"/>
+            </w:pPr>
+            <w:r/>
+            <w:r>
+              <w:rPr>
+                <w:rFonts w:ascii="Calibri" w:hAnsi="Calibri" w:eastAsia="Calibri"/>
+                <w:color w:val="243746"/>
+                <w:sz w:val="18"/>
+              </w:rPr>
+              <w:t>Tester</w:t>
+            </w:r>
+          </w:p>
+        </w:tc>
+        <w:tc>
+          <w:tcPr>
+            <w:tcW w:type="dxa" w:w="6960"/>
+            <w:vAlign w:val="center"/>
+            <w:tcMar>
+              <w:top w:w="80" w:type="dxa"/>
+              <w:start w:w="120" w:type="dxa"/>
+              <w:bottom w:w="80" w:type="dxa"/>
+              <w:end w:w="120" w:type="dxa"/>
+            </w:tcMar>
+          </w:tcPr>
+          <w:p>
+            <w:pPr>
+              <w:spacing w:before="0" w:after="0" w:line="252" w:lineRule="auto"/>
+            </w:pPr>
+            <w:r/>
+          </w:p>
+        </w:tc>
+      </w:tr>
+      <w:tr>
+        <w:trPr>
+          <w:cantSplit/>
+        </w:trPr>
+        <w:tc>
+          <w:tcPr>
+            <w:tcW w:type="dxa" w:w="2400"/>
+            <w:vAlign w:val="center"/>
+            <w:tcMar>
+              <w:top w:w="80" w:type="dxa"/>
+              <w:start w:w="120" w:type="dxa"/>
+              <w:bottom w:w="80" w:type="dxa"/>
+              <w:end w:w="120" w:type="dxa"/>
+            </w:tcMar>
+            <w:shd w:fill="EFF3F7"/>
+          </w:tcPr>
+          <w:p>
+            <w:pPr>
+              <w:spacing w:before="0" w:after="0" w:line="252" w:lineRule="auto"/>
+            </w:pPr>
+            <w:r/>
+            <w:r>
+              <w:rPr>
+                <w:rFonts w:ascii="Calibri" w:hAnsi="Calibri" w:eastAsia="Calibri"/>
+                <w:color w:val="243746"/>
+                <w:sz w:val="18"/>
+              </w:rPr>
+              <w:t>GitHub commit</w:t>
+            </w:r>
+          </w:p>
+        </w:tc>
+        <w:tc>
+          <w:tcPr>
+            <w:tcW w:type="dxa" w:w="6960"/>
+            <w:vAlign w:val="center"/>
+            <w:tcMar>
+              <w:top w:w="80" w:type="dxa"/>
+              <w:start w:w="120" w:type="dxa"/>
+              <w:bottom w:w="80" w:type="dxa"/>
+              <w:end w:w="120" w:type="dxa"/>
+            </w:tcMar>
+            <w:shd w:fill="EFF3F7"/>
+          </w:tcPr>
+          <w:p>
+            <w:pPr>
+              <w:spacing w:before="0" w:after="0" w:line="252" w:lineRule="auto"/>
+            </w:pPr>
+            <w:r/>
+          </w:p>
+        </w:tc>
+      </w:tr>
+      <w:tr>
+        <w:trPr>
+          <w:cantSplit/>
+        </w:trPr>
+        <w:tc>
+          <w:tcPr>
+            <w:tcW w:type="dxa" w:w="2400"/>
+            <w:vAlign w:val="center"/>
+            <w:tcMar>
+              <w:top w:w="80" w:type="dxa"/>
+              <w:start w:w="120" w:type="dxa"/>
+              <w:bottom w:w="80" w:type="dxa"/>
+              <w:end w:w="120" w:type="dxa"/>
+            </w:tcMar>
+          </w:tcPr>
+          <w:p>
+            <w:pPr>
+              <w:spacing w:before="0" w:after="0" w:line="252" w:lineRule="auto"/>
+            </w:pPr>
+            <w:r/>
+            <w:r>
+              <w:rPr>
+                <w:rFonts w:ascii="Calibri" w:hAnsi="Calibri" w:eastAsia="Calibri"/>
+                <w:color w:val="243746"/>
+                <w:sz w:val="18"/>
+              </w:rPr>
+              <w:t>Render frontend URL</w:t>
+            </w:r>
+          </w:p>
+        </w:tc>
+        <w:tc>
+          <w:tcPr>
+            <w:tcW w:type="dxa" w:w="6960"/>
+            <w:vAlign w:val="center"/>
+            <w:tcMar>
+              <w:top w:w="80" w:type="dxa"/>
+              <w:start w:w="120" w:type="dxa"/>
+              <w:bottom w:w="80" w:type="dxa"/>
+              <w:end w:w="120" w:type="dxa"/>
+            </w:tcMar>
+          </w:tcPr>
+          <w:p>
+            <w:pPr>
+              <w:spacing w:before="0" w:after="0" w:line="252" w:lineRule="auto"/>
+            </w:pPr>
+            <w:r/>
+            <w:hyperlink r:id="rId11">
+              <w:r>
+                <w:rPr>
+                  <w:rFonts w:ascii="Calibri" w:hAnsi="Calibri"/>
+                  <w:color w:val="0563C1"/>
+                  <w:u w:val="single"/>
+                  <w:sz w:val="18"/>
+                </w:rPr>
+                <w:t>https://team04-marine-observation-frontend.onrender.com</w:t>
+              </w:r>
+            </w:hyperlink>
+          </w:p>
+        </w:tc>
+      </w:tr>
+      <w:tr>
+        <w:trPr>
+          <w:cantSplit/>
+        </w:trPr>
+        <w:tc>
+          <w:tcPr>
+            <w:tcW w:type="dxa" w:w="2400"/>
+            <w:vAlign w:val="center"/>
+            <w:tcMar>
+              <w:top w:w="80" w:type="dxa"/>
+              <w:start w:w="120" w:type="dxa"/>
+              <w:bottom w:w="80" w:type="dxa"/>
+              <w:end w:w="120" w:type="dxa"/>
+            </w:tcMar>
+            <w:shd w:fill="EFF3F7"/>
+          </w:tcPr>
+          <w:p>
+            <w:pPr>
+              <w:spacing w:before="0" w:after="0" w:line="252" w:lineRule="auto"/>
+            </w:pPr>
+            <w:r/>
+            <w:r>
+              <w:rPr>
+                <w:rFonts w:ascii="Calibri" w:hAnsi="Calibri" w:eastAsia="Calibri"/>
+                <w:color w:val="243746"/>
+                <w:sz w:val="18"/>
+              </w:rPr>
+              <w:t>Render API URL</w:t>
+            </w:r>
+          </w:p>
+        </w:tc>
+        <w:tc>
+          <w:tcPr>
+            <w:tcW w:type="dxa" w:w="6960"/>
+            <w:vAlign w:val="center"/>
+            <w:tcMar>
+              <w:top w:w="80" w:type="dxa"/>
+              <w:start w:w="120" w:type="dxa"/>
+              <w:bottom w:w="80" w:type="dxa"/>
+              <w:end w:w="120" w:type="dxa"/>
+            </w:tcMar>
+            <w:shd w:fill="EFF3F7"/>
+          </w:tcPr>
+          <w:p>
+            <w:pPr>
+              <w:spacing w:before="0" w:after="0" w:line="252" w:lineRule="auto"/>
+            </w:pPr>
+            <w:r/>
+            <w:hyperlink r:id="rId12">
+              <w:r>
+                <w:rPr>
+                  <w:rFonts w:ascii="Calibri" w:hAnsi="Calibri"/>
+                  <w:color w:val="0563C1"/>
+                  <w:u w:val="single"/>
+                  <w:sz w:val="18"/>
+                </w:rPr>
+                <w:t>https://team04-marine-observation-api.onrender.com</w:t>
+              </w:r>
+            </w:hyperlink>
+          </w:p>
+        </w:tc>
+      </w:tr>
+      <w:tr>
+        <w:trPr>
+          <w:cantSplit/>
+        </w:trPr>
+        <w:tc>
+          <w:tcPr>
+            <w:tcW w:type="dxa" w:w="2400"/>
+            <w:vAlign w:val="center"/>
+            <w:tcMar>
+              <w:top w:w="80" w:type="dxa"/>
+              <w:start w:w="120" w:type="dxa"/>
+              <w:bottom w:w="80" w:type="dxa"/>
+              <w:end w:w="120" w:type="dxa"/>
+            </w:tcMar>
+          </w:tcPr>
+          <w:p>
+            <w:pPr>
+              <w:spacing w:before="0" w:after="0" w:line="252" w:lineRule="auto"/>
+            </w:pPr>
+            <w:r/>
+            <w:r>
+              <w:rPr>
+                <w:rFonts w:ascii="Calibri" w:hAnsi="Calibri" w:eastAsia="Calibri"/>
+                <w:color w:val="243746"/>
+                <w:sz w:val="18"/>
+              </w:rPr>
+              <w:t>Synthetic test case</w:t>
+            </w:r>
+          </w:p>
+        </w:tc>
+        <w:tc>
+          <w:tcPr>
+            <w:tcW w:type="dxa" w:w="6960"/>
+            <w:vAlign w:val="center"/>
+            <w:tcMar>
+              <w:top w:w="80" w:type="dxa"/>
+              <w:start w:w="120" w:type="dxa"/>
+              <w:bottom w:w="80" w:type="dxa"/>
+              <w:end w:w="120" w:type="dxa"/>
+            </w:tcMar>
+          </w:tcPr>
+          <w:p>
+            <w:pPr>
+              <w:spacing w:before="0" w:after="0" w:line="252" w:lineRule="auto"/>
+            </w:pPr>
+            <w:r/>
+          </w:p>
+        </w:tc>
+      </w:tr>
+      <w:tr>
+        <w:trPr>
+          <w:cantSplit/>
+        </w:trPr>
+        <w:tc>
+          <w:tcPr>
+            <w:tcW w:type="dxa" w:w="2400"/>
+            <w:vAlign w:val="center"/>
+            <w:tcMar>
+              <w:top w:w="80" w:type="dxa"/>
+              <w:start w:w="120" w:type="dxa"/>
+              <w:bottom w:w="80" w:type="dxa"/>
+              <w:end w:w="120" w:type="dxa"/>
+            </w:tcMar>
+            <w:shd w:fill="EFF3F7"/>
+          </w:tcPr>
+          <w:p>
+            <w:pPr>
+              <w:spacing w:before="0" w:after="0" w:line="252" w:lineRule="auto"/>
+            </w:pPr>
+            <w:r/>
+            <w:r>
+              <w:rPr>
+                <w:rFonts w:ascii="Calibri" w:hAnsi="Calibri" w:eastAsia="Calibri"/>
+                <w:color w:val="243746"/>
+                <w:sz w:val="18"/>
+              </w:rPr>
+              <w:t>Overall result</w:t>
+            </w:r>
+          </w:p>
+        </w:tc>
+        <w:tc>
+          <w:tcPr>
+            <w:tcW w:type="dxa" w:w="6960"/>
+            <w:vAlign w:val="center"/>
+            <w:tcMar>
+              <w:top w:w="80" w:type="dxa"/>
+              <w:start w:w="120" w:type="dxa"/>
+              <w:bottom w:w="80" w:type="dxa"/>
+              <w:end w:w="120" w:type="dxa"/>
+            </w:tcMar>
+            <w:shd w:fill="EFF3F7"/>
+          </w:tcPr>
+          <w:p>
+            <w:pPr>
+              <w:spacing w:before="0" w:after="0" w:line="252" w:lineRule="auto"/>
+            </w:pPr>
+            <w:r/>
+            <w:r>
+              <w:rPr>
+                <w:rFonts w:ascii="Calibri" w:hAnsi="Calibri" w:eastAsia="Calibri"/>
+                <w:color w:val="243746"/>
+                <w:sz w:val="18"/>
+              </w:rPr>
+              <w:t>Pass / Pass with limitations / Fail</w:t>
+            </w:r>
+          </w:p>
+        </w:tc>
+      </w:tr>
+    </w:tbl>
+    <w:p>
+      <w:pPr>
+        <w:pStyle w:val="Heading1"/>
+      </w:pPr>
+      <w:r>
+        <w:t>Preconditions</w:t>
+      </w:r>
+    </w:p>
+    <w:p>
+      <w:pPr>
+        <w:spacing w:before="0" w:after="80" w:line="280" w:lineRule="auto"/>
+        <w:numPr>
+          <w:ilvl w:val="0"/>
+          <w:numId w:val="11"/>
+        </w:numPr>
+      </w:pPr>
+      <w:r>
+        <w:rPr>
+          <w:rFonts w:ascii="Calibri" w:hAnsi="Calibri" w:eastAsia="Calibri"/>
+          <w:color w:val="243746"/>
+          <w:sz w:val="22"/>
+        </w:rPr>
+        <w:t xml:space="preserve">The release commit is identified and matches the intended </w:t>
+      </w:r>
+      <w:r>
+        <w:rPr>
+          <w:rFonts w:ascii="Consolas" w:hAnsi="Consolas" w:eastAsia="Consolas"/>
+          <w:color w:val="183B56"/>
+          <w:sz w:val="20"/>
+        </w:rPr>
+        <w:t>main</w:t>
+      </w:r>
+      <w:r>
+        <w:rPr>
+          <w:rFonts w:ascii="Calibri" w:hAnsi="Calibri" w:eastAsia="Calibri"/>
+          <w:color w:val="243746"/>
+          <w:sz w:val="22"/>
+        </w:rPr>
+        <w:t xml:space="preserve"> state.</w:t>
+      </w:r>
+    </w:p>
+    <w:p>
+      <w:pPr>
+        <w:spacing w:before="0" w:after="80" w:line="280" w:lineRule="auto"/>
+        <w:numPr>
+          <w:ilvl w:val="0"/>
+          <w:numId w:val="11"/>
+        </w:numPr>
+      </w:pPr>
+      <w:r>
+        <w:rPr>
+          <w:rFonts w:ascii="Calibri" w:hAnsi="Calibri" w:eastAsia="Calibri"/>
+          <w:color w:val="243746"/>
+          <w:sz w:val="22"/>
+        </w:rPr>
+        <w:t>The frontend and API services are reachable over HTTPS.</w:t>
+      </w:r>
+    </w:p>
+    <w:p>
+      <w:pPr>
+        <w:spacing w:before="0" w:after="80" w:line="280" w:lineRule="auto"/>
+        <w:numPr>
+          <w:ilvl w:val="0"/>
+          <w:numId w:val="11"/>
+        </w:numPr>
+      </w:pPr>
+      <w:r>
+        <w:rPr>
+          <w:rFonts w:ascii="Consolas" w:hAnsi="Consolas" w:eastAsia="Consolas"/>
+          <w:color w:val="183B56"/>
+          <w:sz w:val="20"/>
+        </w:rPr>
+        <w:t>DATABASE_URL</w:t>
+      </w:r>
+      <w:r>
+        <w:rPr>
+          <w:rFonts w:ascii="Calibri" w:hAnsi="Calibri" w:eastAsia="Calibri"/>
+          <w:color w:val="243746"/>
+          <w:sz w:val="22"/>
+        </w:rPr>
+        <w:t xml:space="preserve"> is configured privately in Render and is not visible in Git or screenshots.</w:t>
+      </w:r>
+    </w:p>
+    <w:p>
+      <w:pPr>
+        <w:spacing w:before="0" w:after="80" w:line="280" w:lineRule="auto"/>
+        <w:numPr>
+          <w:ilvl w:val="0"/>
+          <w:numId w:val="11"/>
+        </w:numPr>
+      </w:pPr>
+      <w:r>
+        <w:rPr>
+          <w:rFonts w:ascii="Calibri" w:hAnsi="Calibri" w:eastAsia="Calibri"/>
+          <w:color w:val="243746"/>
+          <w:sz w:val="22"/>
+        </w:rPr>
+        <w:t>The test uses invented values and a non-sensitive demonstration location.</w:t>
+      </w:r>
+    </w:p>
+    <w:p>
+      <w:pPr>
+        <w:spacing w:before="0" w:after="80" w:line="280" w:lineRule="auto"/>
+        <w:numPr>
+          <w:ilvl w:val="0"/>
+          <w:numId w:val="11"/>
+        </w:numPr>
+      </w:pPr>
+      <w:r>
+        <w:rPr>
+          <w:rFonts w:ascii="Calibri" w:hAnsi="Calibri" w:eastAsia="Calibri"/>
+          <w:color w:val="243746"/>
+          <w:sz w:val="22"/>
+        </w:rPr>
+        <w:t>The tester has opened the browser console and can capture status codes or error evidence.</w:t>
       </w:r>
     </w:p>
     <w:p>
@@ -37,133 +705,333 @@
         <w:pStyle w:val="Heading1"/>
       </w:pPr>
       <w:r>
-        <w:t>Functional checks</w:t>
+        <w:t>End-to-end functional checks</w:t>
       </w:r>
     </w:p>
     <w:p>
       <w:pPr>
-        <w:pStyle w:val="ListBullet"/>
-        <w:spacing w:after="60"/>
+        <w:spacing w:before="0" w:after="80" w:line="280" w:lineRule="auto"/>
+        <w:numPr>
+          <w:ilvl w:val="0"/>
+          <w:numId w:val="11"/>
+        </w:numPr>
       </w:pPr>
       <w:r>
         <w:rPr>
-          <w:rFonts w:ascii="Aptos" w:hAnsi="Aptos"/>
-          <w:color w:val="1F3742"/>
-          <w:sz w:val="21"/>
+          <w:rFonts w:ascii="Calibri" w:hAnsi="Calibri" w:eastAsia="Calibri"/>
+          <w:color w:val="243746"/>
+          <w:sz w:val="22"/>
         </w:rPr>
-        <w:t>Report form accepts one supported litter category, area, time and valid coordinates.</w:t>
+        <w:t>The report form accepts one supported category, area, time and valid coordinates.</w:t>
       </w:r>
     </w:p>
     <w:p>
       <w:pPr>
-        <w:pStyle w:val="ListBullet"/>
-        <w:spacing w:after="60"/>
+        <w:spacing w:before="0" w:after="80" w:line="280" w:lineRule="auto"/>
+        <w:numPr>
+          <w:ilvl w:val="0"/>
+          <w:numId w:val="11"/>
+        </w:numPr>
       </w:pPr>
       <w:r>
         <w:rPr>
-          <w:rFonts w:ascii="Aptos" w:hAnsi="Aptos"/>
-          <w:color w:val="1F3742"/>
-          <w:sz w:val="21"/>
+          <w:rFonts w:ascii="Calibri" w:hAnsi="Calibri" w:eastAsia="Calibri"/>
+          <w:color w:val="243746"/>
+          <w:sz w:val="22"/>
         </w:rPr>
-        <w:t>Invalid category, coordinate, time, image URL or overlong text is rejected with a clear message.</w:t>
+        <w:t>The Approximate area native dropdown displays all five source-labelled</w:t>
       </w:r>
     </w:p>
     <w:p>
       <w:pPr>
-        <w:pStyle w:val="ListBullet"/>
-        <w:spacing w:after="60"/>
+        <w:spacing w:before="0" w:after="120" w:line="264" w:lineRule="auto"/>
       </w:pPr>
       <w:r>
         <w:rPr>
-          <w:rFonts w:ascii="Aptos" w:hAnsi="Aptos"/>
-          <w:color w:val="1F3742"/>
-          <w:sz w:val="21"/>
+          <w:rFonts w:ascii="Calibri" w:hAnsi="Calibri" w:eastAsia="Calibri"/>
+          <w:color w:val="243746"/>
+          <w:sz w:val="22"/>
         </w:rPr>
-        <w:t>Review shows all entered values and allows editing.</w:t>
+        <w:t xml:space="preserve">coarse area suggestions after </w:t>
+      </w:r>
+      <w:r>
+        <w:rPr>
+          <w:rFonts w:ascii="Consolas" w:hAnsi="Consolas" w:eastAsia="Consolas"/>
+          <w:color w:val="183B56"/>
+          <w:sz w:val="20"/>
+        </w:rPr>
+        <w:t>/api/options</w:t>
+      </w:r>
+      <w:r>
+        <w:rPr>
+          <w:rFonts w:ascii="Calibri" w:hAnsi="Calibri" w:eastAsia="Calibri"/>
+          <w:color w:val="243746"/>
+          <w:sz w:val="22"/>
+        </w:rPr>
+        <w:t xml:space="preserve"> loads.</w:t>
       </w:r>
     </w:p>
     <w:p>
       <w:pPr>
-        <w:pStyle w:val="ListBullet"/>
-        <w:spacing w:after="60"/>
+        <w:spacing w:before="0" w:after="80" w:line="280" w:lineRule="auto"/>
+        <w:numPr>
+          <w:ilvl w:val="0"/>
+          <w:numId w:val="11"/>
+        </w:numPr>
       </w:pPr>
       <w:r>
         <w:rPr>
-          <w:rFonts w:ascii="Aptos" w:hAnsi="Aptos"/>
-          <w:color w:val="1F3742"/>
-          <w:sz w:val="21"/>
+          <w:rFonts w:ascii="Calibri" w:hAnsi="Calibri" w:eastAsia="Calibri"/>
+          <w:color w:val="243746"/>
+          <w:sz w:val="22"/>
         </w:rPr>
-        <w:t>Editing invalidates the previous confirmation.</w:t>
+        <w:t>Optional notes and a safe HTTPS image URL behave as documented.</w:t>
       </w:r>
     </w:p>
     <w:p>
       <w:pPr>
-        <w:pStyle w:val="ListBullet"/>
-        <w:spacing w:after="60"/>
+        <w:spacing w:before="0" w:after="80" w:line="280" w:lineRule="auto"/>
+        <w:numPr>
+          <w:ilvl w:val="0"/>
+          <w:numId w:val="11"/>
+        </w:numPr>
       </w:pPr>
       <w:r>
         <w:rPr>
-          <w:rFonts w:ascii="Aptos" w:hAnsi="Aptos"/>
-          <w:color w:val="1F3742"/>
-          <w:sz w:val="21"/>
+          <w:rFonts w:ascii="Calibri" w:hAnsi="Calibri" w:eastAsia="Calibri"/>
+          <w:color w:val="243746"/>
+          <w:sz w:val="22"/>
         </w:rPr>
-        <w:t>Only an explicit confirmation submits the record.</w:t>
+        <w:t>Review displays every entered value and provides a clear edit action.</w:t>
       </w:r>
     </w:p>
     <w:p>
       <w:pPr>
-        <w:pStyle w:val="ListBullet"/>
-        <w:spacing w:after="60"/>
+        <w:spacing w:before="0" w:after="80" w:line="280" w:lineRule="auto"/>
+        <w:numPr>
+          <w:ilvl w:val="0"/>
+          <w:numId w:val="11"/>
+        </w:numPr>
       </w:pPr>
       <w:r>
         <w:rPr>
-          <w:rFonts w:ascii="Aptos" w:hAnsi="Aptos"/>
-          <w:color w:val="1F3742"/>
-          <w:sz w:val="21"/>
+          <w:rFonts w:ascii="Calibri" w:hAnsi="Calibri" w:eastAsia="Calibri"/>
+          <w:color w:val="243746"/>
+          <w:sz w:val="22"/>
         </w:rPr>
-        <w:t>Results show the saved observation, classification, illustrative priority and disclaimer.</w:t>
+        <w:t>Editing a reviewed value invalidates the previous confirmation.</w:t>
       </w:r>
     </w:p>
     <w:p>
       <w:pPr>
-        <w:pStyle w:val="ListBullet"/>
-        <w:spacing w:after="60"/>
+        <w:spacing w:before="0" w:after="80" w:line="280" w:lineRule="auto"/>
+        <w:numPr>
+          <w:ilvl w:val="0"/>
+          <w:numId w:val="11"/>
+        </w:numPr>
       </w:pPr>
       <w:r>
         <w:rPr>
-          <w:rFonts w:ascii="Aptos" w:hAnsi="Aptos"/>
-          <w:color w:val="1F3742"/>
-          <w:sz w:val="21"/>
+          <w:rFonts w:ascii="Calibri" w:hAnsi="Calibri" w:eastAsia="Calibri"/>
+          <w:color w:val="243746"/>
+          <w:sz w:val="22"/>
         </w:rPr>
-        <w:t>OBIS context shows source, version and a list fallback beside the map.</w:t>
+        <w:t>Only explicit confirmation submits the record.</w:t>
       </w:r>
     </w:p>
     <w:p>
       <w:pPr>
-        <w:pStyle w:val="ListBullet"/>
-        <w:spacing w:after="60"/>
+        <w:spacing w:before="0" w:after="80" w:line="280" w:lineRule="auto"/>
+        <w:numPr>
+          <w:ilvl w:val="0"/>
+          <w:numId w:val="11"/>
+        </w:numPr>
       </w:pPr>
       <w:r>
         <w:rPr>
-          <w:rFonts w:ascii="Aptos" w:hAnsi="Aptos"/>
-          <w:color w:val="1F3742"/>
-          <w:sz w:val="21"/>
+          <w:rFonts w:ascii="Calibri" w:hAnsi="Calibri" w:eastAsia="Calibri"/>
+          <w:color w:val="243746"/>
+          <w:sz w:val="22"/>
         </w:rPr>
-        <w:t>Sensitive context coordinates are masked or aggregated.</w:t>
+        <w:t>A successful submission shows the saved observation, category result, illustrative priority and disclaimer.</w:t>
       </w:r>
     </w:p>
     <w:p>
       <w:pPr>
-        <w:pStyle w:val="ListBullet"/>
-        <w:spacing w:after="60"/>
+        <w:spacing w:before="0" w:after="80" w:line="280" w:lineRule="auto"/>
+        <w:numPr>
+          <w:ilvl w:val="0"/>
+          <w:numId w:val="11"/>
+        </w:numPr>
       </w:pPr>
       <w:r>
         <w:rPr>
-          <w:rFonts w:ascii="Aptos" w:hAnsi="Aptos"/>
-          <w:color w:val="1F3742"/>
-          <w:sz w:val="21"/>
+          <w:rFonts w:ascii="Calibri" w:hAnsi="Calibri" w:eastAsia="Calibri"/>
+          <w:color w:val="243746"/>
+          <w:sz w:val="22"/>
         </w:rPr>
-        <w:t>API failure shows a retry message and keeps the confirmed draft.</w:t>
+        <w:t>Refreshing the observation view can read back the saved synthetic record.</w:t>
+      </w:r>
+    </w:p>
+    <w:p>
+      <w:pPr>
+        <w:spacing w:before="0" w:after="80" w:line="280" w:lineRule="auto"/>
+        <w:numPr>
+          <w:ilvl w:val="0"/>
+          <w:numId w:val="11"/>
+        </w:numPr>
+      </w:pPr>
+      <w:r>
+        <w:rPr>
+          <w:rFonts w:ascii="Calibri" w:hAnsi="Calibri" w:eastAsia="Calibri"/>
+          <w:color w:val="243746"/>
+          <w:sz w:val="22"/>
+        </w:rPr>
+        <w:t>OBIS context shows source, data version and a list fallback beside the map.</w:t>
+      </w:r>
+    </w:p>
+    <w:p>
+      <w:pPr>
+        <w:spacing w:before="0" w:after="80" w:line="280" w:lineRule="auto"/>
+        <w:numPr>
+          <w:ilvl w:val="0"/>
+          <w:numId w:val="11"/>
+        </w:numPr>
+      </w:pPr>
+      <w:r>
+        <w:rPr>
+          <w:rFonts w:ascii="Calibri" w:hAnsi="Calibri" w:eastAsia="Calibri"/>
+          <w:color w:val="243746"/>
+          <w:sz w:val="22"/>
+        </w:rPr>
+        <w:t>Sensitive context coordinates are approximate or masked.</w:t>
+      </w:r>
+    </w:p>
+    <w:p>
+      <w:pPr>
+        <w:spacing w:before="0" w:after="80" w:line="280" w:lineRule="auto"/>
+        <w:numPr>
+          <w:ilvl w:val="0"/>
+          <w:numId w:val="11"/>
+        </w:numPr>
+      </w:pPr>
+      <w:r>
+        <w:rPr>
+          <w:rFonts w:ascii="Calibri" w:hAnsi="Calibri" w:eastAsia="Calibri"/>
+          <w:color w:val="243746"/>
+          <w:sz w:val="22"/>
+        </w:rPr>
+        <w:t>API failure keeps the confirmed draft and provides a clear retry message.</w:t>
+      </w:r>
+    </w:p>
+    <w:p>
+      <w:pPr>
+        <w:pStyle w:val="Heading1"/>
+      </w:pPr>
+      <w:r>
+        <w:t>Validation and error checks</w:t>
+      </w:r>
+    </w:p>
+    <w:p>
+      <w:pPr>
+        <w:spacing w:before="0" w:after="80" w:line="280" w:lineRule="auto"/>
+        <w:numPr>
+          <w:ilvl w:val="0"/>
+          <w:numId w:val="11"/>
+        </w:numPr>
+      </w:pPr>
+      <w:r>
+        <w:rPr>
+          <w:rFonts w:ascii="Calibri" w:hAnsi="Calibri" w:eastAsia="Calibri"/>
+          <w:color w:val="243746"/>
+          <w:sz w:val="22"/>
+        </w:rPr>
+        <w:t>An unsupported category is rejected with a clear message.</w:t>
+      </w:r>
+    </w:p>
+    <w:p>
+      <w:pPr>
+        <w:spacing w:before="0" w:after="80" w:line="280" w:lineRule="auto"/>
+        <w:numPr>
+          <w:ilvl w:val="0"/>
+          <w:numId w:val="11"/>
+        </w:numPr>
+      </w:pPr>
+      <w:r>
+        <w:rPr>
+          <w:rFonts w:ascii="Calibri" w:hAnsi="Calibri" w:eastAsia="Calibri"/>
+          <w:color w:val="243746"/>
+          <w:sz w:val="22"/>
+        </w:rPr>
+        <w:t>Missing required values are rejected before submission.</w:t>
+      </w:r>
+    </w:p>
+    <w:p>
+      <w:pPr>
+        <w:spacing w:before="0" w:after="80" w:line="280" w:lineRule="auto"/>
+        <w:numPr>
+          <w:ilvl w:val="0"/>
+          <w:numId w:val="11"/>
+        </w:numPr>
+      </w:pPr>
+      <w:r>
+        <w:rPr>
+          <w:rFonts w:ascii="Calibri" w:hAnsi="Calibri" w:eastAsia="Calibri"/>
+          <w:color w:val="243746"/>
+          <w:sz w:val="22"/>
+        </w:rPr>
+        <w:t>Latitude outside -90 to 90 and longitude outside -180 to 180 are rejected.</w:t>
+      </w:r>
+    </w:p>
+    <w:p>
+      <w:pPr>
+        <w:spacing w:before="0" w:after="80" w:line="280" w:lineRule="auto"/>
+        <w:numPr>
+          <w:ilvl w:val="0"/>
+          <w:numId w:val="11"/>
+        </w:numPr>
+      </w:pPr>
+      <w:r>
+        <w:rPr>
+          <w:rFonts w:ascii="Calibri" w:hAnsi="Calibri" w:eastAsia="Calibri"/>
+          <w:color w:val="243746"/>
+          <w:sz w:val="22"/>
+        </w:rPr>
+        <w:t>A future observation time, unsafe image URL or overlong notes are rejected.</w:t>
+      </w:r>
+    </w:p>
+    <w:p>
+      <w:pPr>
+        <w:spacing w:before="0" w:after="80" w:line="280" w:lineRule="auto"/>
+        <w:numPr>
+          <w:ilvl w:val="0"/>
+          <w:numId w:val="11"/>
+        </w:numPr>
+      </w:pPr>
+      <w:r>
+        <w:rPr>
+          <w:rFonts w:ascii="Calibri" w:hAnsi="Calibri" w:eastAsia="Calibri"/>
+          <w:color w:val="243746"/>
+          <w:sz w:val="22"/>
+        </w:rPr>
+        <w:t>Validation identifies the field that needs correction.</w:t>
+      </w:r>
+    </w:p>
+    <w:p>
+      <w:pPr>
+        <w:spacing w:before="0" w:after="80" w:line="280" w:lineRule="auto"/>
+        <w:numPr>
+          <w:ilvl w:val="0"/>
+          <w:numId w:val="11"/>
+        </w:numPr>
+      </w:pPr>
+      <w:r>
+        <w:rPr>
+          <w:rFonts w:ascii="Calibri" w:hAnsi="Calibri" w:eastAsia="Calibri"/>
+          <w:color w:val="243746"/>
+          <w:sz w:val="22"/>
+        </w:rPr>
+        <w:t>The interface does not display raw stack traces, database details or credentials.</w:t>
       </w:r>
     </w:p>
     <w:p>
@@ -174,88 +1042,826 @@
         <w:t>API checks</w:t>
       </w:r>
     </w:p>
+    <w:tbl>
+      <w:tblPr>
+        <w:tblStyle w:val="TableGrid"/>
+        <w:jc w:val="left"/>
+        <w:tblLook w:firstColumn="1" w:firstRow="1" w:lastColumn="0" w:lastRow="0" w:noHBand="0" w:noVBand="1" w:val="04A0"/>
+        <w:tblW w:w="9360" w:type="dxa"/>
+        <w:tblInd w:w="120" w:type="dxa"/>
+        <w:tblLayout w:type="fixed"/>
+      </w:tblPr>
+      <w:tblGrid>
+        <w:gridCol w:w="2250"/>
+        <w:gridCol w:w="4010"/>
+        <w:gridCol w:w="3100"/>
+      </w:tblGrid>
+      <w:tr>
+        <w:trPr>
+          <w:tblHeader w:val="true"/>
+          <w:cantSplit/>
+        </w:trPr>
+        <w:tc>
+          <w:tcPr>
+            <w:tcW w:type="dxa" w:w="2250"/>
+            <w:vAlign w:val="center"/>
+            <w:tcMar>
+              <w:top w:w="80" w:type="dxa"/>
+              <w:start w:w="120" w:type="dxa"/>
+              <w:bottom w:w="80" w:type="dxa"/>
+              <w:end w:w="120" w:type="dxa"/>
+            </w:tcMar>
+            <w:shd w:fill="183B56"/>
+          </w:tcPr>
+          <w:p>
+            <w:pPr>
+              <w:spacing w:before="0" w:after="0" w:line="252" w:lineRule="auto"/>
+            </w:pPr>
+            <w:r>
+              <w:rPr>
+                <w:b/>
+              </w:rPr>
+            </w:r>
+            <w:r>
+              <w:rPr>
+                <w:rFonts w:ascii="Calibri" w:hAnsi="Calibri" w:eastAsia="Calibri"/>
+                <w:b/>
+                <w:color w:val="FFFFFF"/>
+                <w:sz w:val="18"/>
+              </w:rPr>
+              <w:t>Check</w:t>
+            </w:r>
+          </w:p>
+        </w:tc>
+        <w:tc>
+          <w:tcPr>
+            <w:tcW w:type="dxa" w:w="4010"/>
+            <w:vAlign w:val="center"/>
+            <w:tcMar>
+              <w:top w:w="80" w:type="dxa"/>
+              <w:start w:w="120" w:type="dxa"/>
+              <w:bottom w:w="80" w:type="dxa"/>
+              <w:end w:w="120" w:type="dxa"/>
+            </w:tcMar>
+            <w:shd w:fill="183B56"/>
+          </w:tcPr>
+          <w:p>
+            <w:pPr>
+              <w:spacing w:before="0" w:after="0" w:line="252" w:lineRule="auto"/>
+            </w:pPr>
+            <w:r>
+              <w:rPr>
+                <w:b/>
+              </w:rPr>
+            </w:r>
+            <w:r>
+              <w:rPr>
+                <w:rFonts w:ascii="Calibri" w:hAnsi="Calibri" w:eastAsia="Calibri"/>
+                <w:b/>
+                <w:color w:val="FFFFFF"/>
+                <w:sz w:val="18"/>
+              </w:rPr>
+              <w:t>Expected result</w:t>
+            </w:r>
+          </w:p>
+        </w:tc>
+        <w:tc>
+          <w:tcPr>
+            <w:tcW w:type="dxa" w:w="3100"/>
+            <w:vAlign w:val="center"/>
+            <w:tcMar>
+              <w:top w:w="80" w:type="dxa"/>
+              <w:start w:w="120" w:type="dxa"/>
+              <w:bottom w:w="80" w:type="dxa"/>
+              <w:end w:w="120" w:type="dxa"/>
+            </w:tcMar>
+            <w:shd w:fill="183B56"/>
+          </w:tcPr>
+          <w:p>
+            <w:pPr>
+              <w:spacing w:before="0" w:after="0" w:line="252" w:lineRule="auto"/>
+            </w:pPr>
+            <w:r>
+              <w:rPr>
+                <w:b/>
+              </w:rPr>
+            </w:r>
+            <w:r>
+              <w:rPr>
+                <w:rFonts w:ascii="Calibri" w:hAnsi="Calibri" w:eastAsia="Calibri"/>
+                <w:b/>
+                <w:color w:val="FFFFFF"/>
+                <w:sz w:val="18"/>
+              </w:rPr>
+              <w:t>Evidence</w:t>
+            </w:r>
+          </w:p>
+        </w:tc>
+      </w:tr>
+      <w:tr>
+        <w:trPr>
+          <w:cantSplit/>
+        </w:trPr>
+        <w:tc>
+          <w:tcPr>
+            <w:tcW w:type="dxa" w:w="2250"/>
+            <w:vAlign w:val="center"/>
+            <w:tcMar>
+              <w:top w:w="80" w:type="dxa"/>
+              <w:start w:w="120" w:type="dxa"/>
+              <w:bottom w:w="80" w:type="dxa"/>
+              <w:end w:w="120" w:type="dxa"/>
+            </w:tcMar>
+            <w:shd w:fill="EFF3F7"/>
+          </w:tcPr>
+          <w:p>
+            <w:pPr>
+              <w:spacing w:before="0" w:after="0" w:line="252" w:lineRule="auto"/>
+            </w:pPr>
+            <w:r/>
+            <w:r>
+              <w:rPr>
+                <w:rFonts w:ascii="Consolas" w:hAnsi="Consolas" w:eastAsia="Consolas"/>
+                <w:color w:val="183B56"/>
+                <w:sz w:val="18"/>
+              </w:rPr>
+              <w:t>GET /health</w:t>
+            </w:r>
+          </w:p>
+        </w:tc>
+        <w:tc>
+          <w:tcPr>
+            <w:tcW w:type="dxa" w:w="4010"/>
+            <w:vAlign w:val="center"/>
+            <w:tcMar>
+              <w:top w:w="80" w:type="dxa"/>
+              <w:start w:w="120" w:type="dxa"/>
+              <w:bottom w:w="80" w:type="dxa"/>
+              <w:end w:w="120" w:type="dxa"/>
+            </w:tcMar>
+            <w:shd w:fill="EFF3F7"/>
+          </w:tcPr>
+          <w:p>
+            <w:pPr>
+              <w:spacing w:before="0" w:after="0" w:line="252" w:lineRule="auto"/>
+            </w:pPr>
+            <w:r/>
+            <w:r>
+              <w:rPr>
+                <w:rFonts w:ascii="Calibri" w:hAnsi="Calibri" w:eastAsia="Calibri"/>
+                <w:color w:val="243746"/>
+                <w:sz w:val="18"/>
+              </w:rPr>
+              <w:t>HTTP 200; service, synthetic/public boundary and database mode are present</w:t>
+            </w:r>
+          </w:p>
+        </w:tc>
+        <w:tc>
+          <w:tcPr>
+            <w:tcW w:type="dxa" w:w="3100"/>
+            <w:vAlign w:val="center"/>
+            <w:tcMar>
+              <w:top w:w="80" w:type="dxa"/>
+              <w:start w:w="120" w:type="dxa"/>
+              <w:bottom w:w="80" w:type="dxa"/>
+              <w:end w:w="120" w:type="dxa"/>
+            </w:tcMar>
+            <w:shd w:fill="EFF3F7"/>
+          </w:tcPr>
+          <w:p>
+            <w:pPr>
+              <w:spacing w:before="0" w:after="0" w:line="252" w:lineRule="auto"/>
+            </w:pPr>
+            <w:r/>
+          </w:p>
+        </w:tc>
+      </w:tr>
+      <w:tr>
+        <w:trPr>
+          <w:cantSplit/>
+        </w:trPr>
+        <w:tc>
+          <w:tcPr>
+            <w:tcW w:type="dxa" w:w="2250"/>
+            <w:vAlign w:val="center"/>
+            <w:tcMar>
+              <w:top w:w="80" w:type="dxa"/>
+              <w:start w:w="120" w:type="dxa"/>
+              <w:bottom w:w="80" w:type="dxa"/>
+              <w:end w:w="120" w:type="dxa"/>
+            </w:tcMar>
+          </w:tcPr>
+          <w:p>
+            <w:pPr>
+              <w:spacing w:before="0" w:after="0" w:line="252" w:lineRule="auto"/>
+            </w:pPr>
+            <w:r/>
+            <w:r>
+              <w:rPr>
+                <w:rFonts w:ascii="Consolas" w:hAnsi="Consolas" w:eastAsia="Consolas"/>
+                <w:color w:val="183B56"/>
+                <w:sz w:val="18"/>
+              </w:rPr>
+              <w:t>GET /api/context</w:t>
+            </w:r>
+          </w:p>
+        </w:tc>
+        <w:tc>
+          <w:tcPr>
+            <w:tcW w:type="dxa" w:w="4010"/>
+            <w:vAlign w:val="center"/>
+            <w:tcMar>
+              <w:top w:w="80" w:type="dxa"/>
+              <w:start w:w="120" w:type="dxa"/>
+              <w:bottom w:w="80" w:type="dxa"/>
+              <w:end w:w="120" w:type="dxa"/>
+            </w:tcMar>
+          </w:tcPr>
+          <w:p>
+            <w:pPr>
+              <w:spacing w:before="0" w:after="0" w:line="252" w:lineRule="auto"/>
+            </w:pPr>
+            <w:r/>
+            <w:r>
+              <w:rPr>
+                <w:rFonts w:ascii="Calibri" w:hAnsi="Calibri" w:eastAsia="Calibri"/>
+                <w:color w:val="243746"/>
+                <w:sz w:val="18"/>
+              </w:rPr>
+              <w:t>HTTP 200; OBIS source and data version are present</w:t>
+            </w:r>
+          </w:p>
+        </w:tc>
+        <w:tc>
+          <w:tcPr>
+            <w:tcW w:type="dxa" w:w="3100"/>
+            <w:vAlign w:val="center"/>
+            <w:tcMar>
+              <w:top w:w="80" w:type="dxa"/>
+              <w:start w:w="120" w:type="dxa"/>
+              <w:bottom w:w="80" w:type="dxa"/>
+              <w:end w:w="120" w:type="dxa"/>
+            </w:tcMar>
+          </w:tcPr>
+          <w:p>
+            <w:pPr>
+              <w:spacing w:before="0" w:after="0" w:line="252" w:lineRule="auto"/>
+            </w:pPr>
+            <w:r/>
+          </w:p>
+        </w:tc>
+      </w:tr>
+      <w:tr>
+        <w:trPr>
+          <w:cantSplit/>
+        </w:trPr>
+        <w:tc>
+          <w:tcPr>
+            <w:tcW w:type="dxa" w:w="2250"/>
+            <w:vAlign w:val="center"/>
+            <w:tcMar>
+              <w:top w:w="80" w:type="dxa"/>
+              <w:start w:w="120" w:type="dxa"/>
+              <w:bottom w:w="80" w:type="dxa"/>
+              <w:end w:w="120" w:type="dxa"/>
+            </w:tcMar>
+            <w:shd w:fill="EFF3F7"/>
+          </w:tcPr>
+          <w:p>
+            <w:pPr>
+              <w:spacing w:before="0" w:after="0" w:line="252" w:lineRule="auto"/>
+            </w:pPr>
+            <w:r/>
+            <w:r>
+              <w:rPr>
+                <w:rFonts w:ascii="Consolas" w:hAnsi="Consolas" w:eastAsia="Consolas"/>
+                <w:color w:val="183B56"/>
+                <w:sz w:val="18"/>
+              </w:rPr>
+              <w:t>GET /api/options</w:t>
+            </w:r>
+          </w:p>
+        </w:tc>
+        <w:tc>
+          <w:tcPr>
+            <w:tcW w:type="dxa" w:w="4010"/>
+            <w:vAlign w:val="center"/>
+            <w:tcMar>
+              <w:top w:w="80" w:type="dxa"/>
+              <w:start w:w="120" w:type="dxa"/>
+              <w:bottom w:w="80" w:type="dxa"/>
+              <w:end w:w="120" w:type="dxa"/>
+            </w:tcMar>
+            <w:shd w:fill="EFF3F7"/>
+          </w:tcPr>
+          <w:p>
+            <w:pPr>
+              <w:spacing w:before="0" w:after="0" w:line="252" w:lineRule="auto"/>
+            </w:pPr>
+            <w:r/>
+            <w:r>
+              <w:rPr>
+                <w:rFonts w:ascii="Calibri" w:hAnsi="Calibri" w:eastAsia="Calibri"/>
+                <w:color w:val="243746"/>
+                <w:sz w:val="18"/>
+              </w:rPr>
+              <w:t>HTTP 200; catalogue version and five area labels are present</w:t>
+            </w:r>
+          </w:p>
+        </w:tc>
+        <w:tc>
+          <w:tcPr>
+            <w:tcW w:type="dxa" w:w="3100"/>
+            <w:vAlign w:val="center"/>
+            <w:tcMar>
+              <w:top w:w="80" w:type="dxa"/>
+              <w:start w:w="120" w:type="dxa"/>
+              <w:bottom w:w="80" w:type="dxa"/>
+              <w:end w:w="120" w:type="dxa"/>
+            </w:tcMar>
+            <w:shd w:fill="EFF3F7"/>
+          </w:tcPr>
+          <w:p>
+            <w:pPr>
+              <w:spacing w:before="0" w:after="0" w:line="252" w:lineRule="auto"/>
+            </w:pPr>
+            <w:r/>
+          </w:p>
+        </w:tc>
+      </w:tr>
+      <w:tr>
+        <w:trPr>
+          <w:cantSplit/>
+        </w:trPr>
+        <w:tc>
+          <w:tcPr>
+            <w:tcW w:type="dxa" w:w="2250"/>
+            <w:vAlign w:val="center"/>
+            <w:tcMar>
+              <w:top w:w="80" w:type="dxa"/>
+              <w:start w:w="120" w:type="dxa"/>
+              <w:bottom w:w="80" w:type="dxa"/>
+              <w:end w:w="120" w:type="dxa"/>
+            </w:tcMar>
+          </w:tcPr>
+          <w:p>
+            <w:pPr>
+              <w:spacing w:before="0" w:after="0" w:line="252" w:lineRule="auto"/>
+            </w:pPr>
+            <w:r/>
+            <w:r>
+              <w:rPr>
+                <w:rFonts w:ascii="Calibri" w:hAnsi="Calibri" w:eastAsia="Calibri"/>
+                <w:color w:val="243746"/>
+                <w:sz w:val="18"/>
+              </w:rPr>
+              <w:t xml:space="preserve">Valid </w:t>
+            </w:r>
+            <w:r>
+              <w:rPr>
+                <w:rFonts w:ascii="Consolas" w:hAnsi="Consolas" w:eastAsia="Consolas"/>
+                <w:color w:val="183B56"/>
+                <w:sz w:val="18"/>
+              </w:rPr>
+              <w:t>POST /api/observations</w:t>
+            </w:r>
+          </w:p>
+        </w:tc>
+        <w:tc>
+          <w:tcPr>
+            <w:tcW w:type="dxa" w:w="4010"/>
+            <w:vAlign w:val="center"/>
+            <w:tcMar>
+              <w:top w:w="80" w:type="dxa"/>
+              <w:start w:w="120" w:type="dxa"/>
+              <w:bottom w:w="80" w:type="dxa"/>
+              <w:end w:w="120" w:type="dxa"/>
+            </w:tcMar>
+          </w:tcPr>
+          <w:p>
+            <w:pPr>
+              <w:spacing w:before="0" w:after="0" w:line="252" w:lineRule="auto"/>
+            </w:pPr>
+            <w:r/>
+            <w:r>
+              <w:rPr>
+                <w:rFonts w:ascii="Calibri" w:hAnsi="Calibri" w:eastAsia="Calibri"/>
+                <w:color w:val="243746"/>
+                <w:sz w:val="18"/>
+              </w:rPr>
+              <w:t>HTTP 201; observation and derived fields are returned</w:t>
+            </w:r>
+          </w:p>
+        </w:tc>
+        <w:tc>
+          <w:tcPr>
+            <w:tcW w:type="dxa" w:w="3100"/>
+            <w:vAlign w:val="center"/>
+            <w:tcMar>
+              <w:top w:w="80" w:type="dxa"/>
+              <w:start w:w="120" w:type="dxa"/>
+              <w:bottom w:w="80" w:type="dxa"/>
+              <w:end w:w="120" w:type="dxa"/>
+            </w:tcMar>
+          </w:tcPr>
+          <w:p>
+            <w:pPr>
+              <w:spacing w:before="0" w:after="0" w:line="252" w:lineRule="auto"/>
+            </w:pPr>
+            <w:r/>
+          </w:p>
+        </w:tc>
+      </w:tr>
+      <w:tr>
+        <w:trPr>
+          <w:cantSplit/>
+        </w:trPr>
+        <w:tc>
+          <w:tcPr>
+            <w:tcW w:type="dxa" w:w="2250"/>
+            <w:vAlign w:val="center"/>
+            <w:tcMar>
+              <w:top w:w="80" w:type="dxa"/>
+              <w:start w:w="120" w:type="dxa"/>
+              <w:bottom w:w="80" w:type="dxa"/>
+              <w:end w:w="120" w:type="dxa"/>
+            </w:tcMar>
+            <w:shd w:fill="EFF3F7"/>
+          </w:tcPr>
+          <w:p>
+            <w:pPr>
+              <w:spacing w:before="0" w:after="0" w:line="252" w:lineRule="auto"/>
+            </w:pPr>
+            <w:r/>
+            <w:r>
+              <w:rPr>
+                <w:rFonts w:ascii="Calibri" w:hAnsi="Calibri" w:eastAsia="Calibri"/>
+                <w:color w:val="243746"/>
+                <w:sz w:val="18"/>
+              </w:rPr>
+              <w:t xml:space="preserve">Invalid </w:t>
+            </w:r>
+            <w:r>
+              <w:rPr>
+                <w:rFonts w:ascii="Consolas" w:hAnsi="Consolas" w:eastAsia="Consolas"/>
+                <w:color w:val="183B56"/>
+                <w:sz w:val="18"/>
+              </w:rPr>
+              <w:t>POST /api/observations</w:t>
+            </w:r>
+          </w:p>
+        </w:tc>
+        <w:tc>
+          <w:tcPr>
+            <w:tcW w:type="dxa" w:w="4010"/>
+            <w:vAlign w:val="center"/>
+            <w:tcMar>
+              <w:top w:w="80" w:type="dxa"/>
+              <w:start w:w="120" w:type="dxa"/>
+              <w:bottom w:w="80" w:type="dxa"/>
+              <w:end w:w="120" w:type="dxa"/>
+            </w:tcMar>
+            <w:shd w:fill="EFF3F7"/>
+          </w:tcPr>
+          <w:p>
+            <w:pPr>
+              <w:spacing w:before="0" w:after="0" w:line="252" w:lineRule="auto"/>
+            </w:pPr>
+            <w:r/>
+            <w:r>
+              <w:rPr>
+                <w:rFonts w:ascii="Calibri" w:hAnsi="Calibri" w:eastAsia="Calibri"/>
+                <w:color w:val="243746"/>
+                <w:sz w:val="18"/>
+              </w:rPr>
+              <w:t>HTTP 400 with a safe, actionable validation message</w:t>
+            </w:r>
+          </w:p>
+        </w:tc>
+        <w:tc>
+          <w:tcPr>
+            <w:tcW w:type="dxa" w:w="3100"/>
+            <w:vAlign w:val="center"/>
+            <w:tcMar>
+              <w:top w:w="80" w:type="dxa"/>
+              <w:start w:w="120" w:type="dxa"/>
+              <w:bottom w:w="80" w:type="dxa"/>
+              <w:end w:w="120" w:type="dxa"/>
+            </w:tcMar>
+            <w:shd w:fill="EFF3F7"/>
+          </w:tcPr>
+          <w:p>
+            <w:pPr>
+              <w:spacing w:before="0" w:after="0" w:line="252" w:lineRule="auto"/>
+            </w:pPr>
+            <w:r/>
+          </w:p>
+        </w:tc>
+      </w:tr>
+      <w:tr>
+        <w:trPr>
+          <w:cantSplit/>
+        </w:trPr>
+        <w:tc>
+          <w:tcPr>
+            <w:tcW w:type="dxa" w:w="2250"/>
+            <w:vAlign w:val="center"/>
+            <w:tcMar>
+              <w:top w:w="80" w:type="dxa"/>
+              <w:start w:w="120" w:type="dxa"/>
+              <w:bottom w:w="80" w:type="dxa"/>
+              <w:end w:w="120" w:type="dxa"/>
+            </w:tcMar>
+          </w:tcPr>
+          <w:p>
+            <w:pPr>
+              <w:spacing w:before="0" w:after="0" w:line="252" w:lineRule="auto"/>
+            </w:pPr>
+            <w:r/>
+            <w:r>
+              <w:rPr>
+                <w:rFonts w:ascii="Consolas" w:hAnsi="Consolas" w:eastAsia="Consolas"/>
+                <w:color w:val="183B56"/>
+                <w:sz w:val="18"/>
+              </w:rPr>
+              <w:t>GET /api/observations</w:t>
+            </w:r>
+            <w:r>
+              <w:rPr>
+                <w:rFonts w:ascii="Calibri" w:hAnsi="Calibri" w:eastAsia="Calibri"/>
+                <w:color w:val="243746"/>
+                <w:sz w:val="18"/>
+              </w:rPr>
+              <w:t xml:space="preserve"> after create</w:t>
+            </w:r>
+          </w:p>
+        </w:tc>
+        <w:tc>
+          <w:tcPr>
+            <w:tcW w:type="dxa" w:w="4010"/>
+            <w:vAlign w:val="center"/>
+            <w:tcMar>
+              <w:top w:w="80" w:type="dxa"/>
+              <w:start w:w="120" w:type="dxa"/>
+              <w:bottom w:w="80" w:type="dxa"/>
+              <w:end w:w="120" w:type="dxa"/>
+            </w:tcMar>
+          </w:tcPr>
+          <w:p>
+            <w:pPr>
+              <w:spacing w:before="0" w:after="0" w:line="252" w:lineRule="auto"/>
+            </w:pPr>
+            <w:r/>
+            <w:r>
+              <w:rPr>
+                <w:rFonts w:ascii="Calibri" w:hAnsi="Calibri" w:eastAsia="Calibri"/>
+                <w:color w:val="243746"/>
+                <w:sz w:val="18"/>
+              </w:rPr>
+              <w:t>The saved synthetic record is returned after refresh</w:t>
+            </w:r>
+          </w:p>
+        </w:tc>
+        <w:tc>
+          <w:tcPr>
+            <w:tcW w:type="dxa" w:w="3100"/>
+            <w:vAlign w:val="center"/>
+            <w:tcMar>
+              <w:top w:w="80" w:type="dxa"/>
+              <w:start w:w="120" w:type="dxa"/>
+              <w:bottom w:w="80" w:type="dxa"/>
+              <w:end w:w="120" w:type="dxa"/>
+            </w:tcMar>
+          </w:tcPr>
+          <w:p>
+            <w:pPr>
+              <w:spacing w:before="0" w:after="0" w:line="252" w:lineRule="auto"/>
+            </w:pPr>
+            <w:r/>
+          </w:p>
+        </w:tc>
+      </w:tr>
+      <w:tr>
+        <w:trPr>
+          <w:cantSplit/>
+        </w:trPr>
+        <w:tc>
+          <w:tcPr>
+            <w:tcW w:type="dxa" w:w="2250"/>
+            <w:vAlign w:val="center"/>
+            <w:tcMar>
+              <w:top w:w="80" w:type="dxa"/>
+              <w:start w:w="120" w:type="dxa"/>
+              <w:bottom w:w="80" w:type="dxa"/>
+              <w:end w:w="120" w:type="dxa"/>
+            </w:tcMar>
+            <w:shd w:fill="EFF3F7"/>
+          </w:tcPr>
+          <w:p>
+            <w:pPr>
+              <w:spacing w:before="0" w:after="0" w:line="252" w:lineRule="auto"/>
+            </w:pPr>
+            <w:r/>
+            <w:r>
+              <w:rPr>
+                <w:rFonts w:ascii="Calibri" w:hAnsi="Calibri" w:eastAsia="Calibri"/>
+                <w:color w:val="243746"/>
+                <w:sz w:val="18"/>
+              </w:rPr>
+              <w:t>Response privacy review</w:t>
+            </w:r>
+          </w:p>
+        </w:tc>
+        <w:tc>
+          <w:tcPr>
+            <w:tcW w:type="dxa" w:w="4010"/>
+            <w:vAlign w:val="center"/>
+            <w:tcMar>
+              <w:top w:w="80" w:type="dxa"/>
+              <w:start w:w="120" w:type="dxa"/>
+              <w:bottom w:w="80" w:type="dxa"/>
+              <w:end w:w="120" w:type="dxa"/>
+            </w:tcMar>
+            <w:shd w:fill="EFF3F7"/>
+          </w:tcPr>
+          <w:p>
+            <w:pPr>
+              <w:spacing w:before="0" w:after="0" w:line="252" w:lineRule="auto"/>
+            </w:pPr>
+            <w:r/>
+            <w:r>
+              <w:rPr>
+                <w:rFonts w:ascii="Calibri" w:hAnsi="Calibri" w:eastAsia="Calibri"/>
+                <w:color w:val="243746"/>
+                <w:sz w:val="18"/>
+              </w:rPr>
+              <w:t>No names, phone numbers, accounts, private locations, keys or connection strings</w:t>
+            </w:r>
+          </w:p>
+        </w:tc>
+        <w:tc>
+          <w:tcPr>
+            <w:tcW w:type="dxa" w:w="3100"/>
+            <w:vAlign w:val="center"/>
+            <w:tcMar>
+              <w:top w:w="80" w:type="dxa"/>
+              <w:start w:w="120" w:type="dxa"/>
+              <w:bottom w:w="80" w:type="dxa"/>
+              <w:end w:w="120" w:type="dxa"/>
+            </w:tcMar>
+            <w:shd w:fill="EFF3F7"/>
+          </w:tcPr>
+          <w:p>
+            <w:pPr>
+              <w:spacing w:before="0" w:after="0" w:line="252" w:lineRule="auto"/>
+            </w:pPr>
+            <w:r/>
+          </w:p>
+        </w:tc>
+      </w:tr>
+    </w:tbl>
     <w:p>
       <w:pPr>
-        <w:pStyle w:val="ListBullet"/>
-        <w:spacing w:after="60"/>
+        <w:pStyle w:val="Heading1"/>
       </w:pPr>
       <w:r>
-        <w:rPr>
-          <w:rFonts w:ascii="Aptos" w:hAnsi="Aptos"/>
-          <w:color w:val="1F3742"/>
-          <w:sz w:val="21"/>
-        </w:rPr>
-        <w:t>`GET /health` returns 200 and reports the configured database on Render.</w:t>
+        <w:t>Accessibility and responsive checks</w:t>
       </w:r>
     </w:p>
     <w:p>
       <w:pPr>
-        <w:pStyle w:val="ListBullet"/>
-        <w:spacing w:after="60"/>
+        <w:spacing w:before="0" w:after="80" w:line="280" w:lineRule="auto"/>
+        <w:numPr>
+          <w:ilvl w:val="0"/>
+          <w:numId w:val="11"/>
+        </w:numPr>
       </w:pPr>
       <w:r>
         <w:rPr>
-          <w:rFonts w:ascii="Aptos" w:hAnsi="Aptos"/>
-          <w:color w:val="1F3742"/>
-          <w:sz w:val="21"/>
+          <w:rFonts w:ascii="Calibri" w:hAnsi="Calibri" w:eastAsia="Calibri"/>
+          <w:color w:val="243746"/>
+          <w:sz w:val="22"/>
         </w:rPr>
-        <w:t>`GET /api/context` returns source-labelled OBIS data.</w:t>
+        <w:t>Every input and control has a programmatic label.</w:t>
       </w:r>
     </w:p>
     <w:p>
       <w:pPr>
-        <w:pStyle w:val="ListBullet"/>
-        <w:spacing w:after="60"/>
+        <w:spacing w:before="0" w:after="80" w:line="280" w:lineRule="auto"/>
+        <w:numPr>
+          <w:ilvl w:val="0"/>
+          <w:numId w:val="11"/>
+        </w:numPr>
       </w:pPr>
       <w:r>
         <w:rPr>
-          <w:rFonts w:ascii="Aptos" w:hAnsi="Aptos"/>
-          <w:color w:val="1F3742"/>
-          <w:sz w:val="21"/>
+          <w:rFonts w:ascii="Calibri" w:hAnsi="Calibri" w:eastAsia="Calibri"/>
+          <w:color w:val="243746"/>
+          <w:sz w:val="22"/>
         </w:rPr>
-        <w:t>A valid `POST /api/observations` returns 201 and derived fields.</w:t>
+        <w:t>Keyboard focus is visible and the full flow can be completed without a mouse.</w:t>
       </w:r>
     </w:p>
     <w:p>
       <w:pPr>
-        <w:pStyle w:val="ListBullet"/>
-        <w:spacing w:after="60"/>
+        <w:spacing w:before="0" w:after="80" w:line="280" w:lineRule="auto"/>
+        <w:numPr>
+          <w:ilvl w:val="0"/>
+          <w:numId w:val="11"/>
+        </w:numPr>
       </w:pPr>
       <w:r>
         <w:rPr>
-          <w:rFonts w:ascii="Aptos" w:hAnsi="Aptos"/>
-          <w:color w:val="1F3742"/>
-          <w:sz w:val="21"/>
+          <w:rFonts w:ascii="Calibri" w:hAnsi="Calibri" w:eastAsia="Calibri"/>
+          <w:color w:val="243746"/>
+          <w:sz w:val="22"/>
         </w:rPr>
-        <w:t>Missing fields and invalid values return 400.</w:t>
+        <w:t>Error messages are announced near the field that needs correction.</w:t>
       </w:r>
     </w:p>
     <w:p>
       <w:pPr>
-        <w:pStyle w:val="ListBullet"/>
-        <w:spacing w:after="60"/>
+        <w:spacing w:before="0" w:after="80" w:line="280" w:lineRule="auto"/>
+        <w:numPr>
+          <w:ilvl w:val="0"/>
+          <w:numId w:val="11"/>
+        </w:numPr>
       </w:pPr>
       <w:r>
         <w:rPr>
-          <w:rFonts w:ascii="Aptos" w:hAnsi="Aptos"/>
-          <w:color w:val="1F3742"/>
-          <w:sz w:val="21"/>
+          <w:rFonts w:ascii="Calibri" w:hAnsi="Calibri" w:eastAsia="Calibri"/>
+          <w:color w:val="243746"/>
+          <w:sz w:val="22"/>
         </w:rPr>
-        <w:t>`GET /api/observations` can read the saved synthetic record after refresh.</w:t>
+        <w:t>Status is explained with text or symbols and not by colour alone.</w:t>
       </w:r>
     </w:p>
     <w:p>
       <w:pPr>
-        <w:pStyle w:val="ListBullet"/>
-        <w:spacing w:after="60"/>
+        <w:spacing w:before="0" w:after="80" w:line="280" w:lineRule="auto"/>
+        <w:numPr>
+          <w:ilvl w:val="0"/>
+          <w:numId w:val="11"/>
+        </w:numPr>
       </w:pPr>
       <w:r>
         <w:rPr>
-          <w:rFonts w:ascii="Aptos" w:hAnsi="Aptos"/>
-          <w:color w:val="1F3742"/>
-          <w:sz w:val="21"/>
+          <w:rFonts w:ascii="Calibri" w:hAnsi="Calibri" w:eastAsia="Calibri"/>
+          <w:color w:val="243746"/>
+          <w:sz w:val="22"/>
         </w:rPr>
-        <w:t>No response contains names, phone numbers, accounts or secrets.</w:t>
+        <w:t>The map has an accessible list fallback containing equivalent context.</w:t>
+      </w:r>
+    </w:p>
+    <w:p>
+      <w:pPr>
+        <w:spacing w:before="0" w:after="80" w:line="280" w:lineRule="auto"/>
+        <w:numPr>
+          <w:ilvl w:val="0"/>
+          <w:numId w:val="11"/>
+        </w:numPr>
+      </w:pPr>
+      <w:r>
+        <w:rPr>
+          <w:rFonts w:ascii="Calibri" w:hAnsi="Calibri" w:eastAsia="Calibri"/>
+          <w:color w:val="243746"/>
+          <w:sz w:val="22"/>
+        </w:rPr>
+        <w:t>The 375 px layout has no horizontal overflow or clipped controls.</w:t>
+      </w:r>
+    </w:p>
+    <w:p>
+      <w:pPr>
+        <w:spacing w:before="0" w:after="80" w:line="280" w:lineRule="auto"/>
+        <w:numPr>
+          <w:ilvl w:val="0"/>
+          <w:numId w:val="11"/>
+        </w:numPr>
+      </w:pPr>
+      <w:r>
+        <w:rPr>
+          <w:rFonts w:ascii="Calibri" w:hAnsi="Calibri" w:eastAsia="Calibri"/>
+          <w:color w:val="243746"/>
+          <w:sz w:val="22"/>
+        </w:rPr>
+        <w:t>Zoom at 200% keeps content readable and actions available.</w:t>
+      </w:r>
+    </w:p>
+    <w:p>
+      <w:pPr>
+        <w:spacing w:before="0" w:after="80" w:line="280" w:lineRule="auto"/>
+        <w:numPr>
+          <w:ilvl w:val="0"/>
+          <w:numId w:val="11"/>
+        </w:numPr>
+      </w:pPr>
+      <w:r>
+        <w:rPr>
+          <w:rFonts w:ascii="Calibri" w:hAnsi="Calibri" w:eastAsia="Calibri"/>
+          <w:color w:val="243746"/>
+          <w:sz w:val="22"/>
+        </w:rPr>
+        <w:t>Headings, landmarks and reading order are logical.</w:t>
       </w:r>
     </w:p>
     <w:p>
@@ -263,77 +1869,126 @@
         <w:pStyle w:val="Heading1"/>
       </w:pPr>
       <w:r>
-        <w:t>Accessibility checks</w:t>
+        <w:t>Data, safety and interpretation checks</w:t>
       </w:r>
     </w:p>
     <w:p>
       <w:pPr>
-        <w:pStyle w:val="ListBullet"/>
-        <w:spacing w:after="60"/>
+        <w:spacing w:before="0" w:after="80" w:line="280" w:lineRule="auto"/>
+        <w:numPr>
+          <w:ilvl w:val="0"/>
+          <w:numId w:val="11"/>
+        </w:numPr>
       </w:pPr>
       <w:r>
         <w:rPr>
-          <w:rFonts w:ascii="Aptos" w:hAnsi="Aptos"/>
-          <w:color w:val="1F3742"/>
-          <w:sz w:val="21"/>
+          <w:rFonts w:ascii="Calibri" w:hAnsi="Calibri" w:eastAsia="Calibri"/>
+          <w:color w:val="243746"/>
+          <w:sz w:val="22"/>
         </w:rPr>
-        <w:t>All controls have labels and visible focus.</w:t>
+        <w:t>All entered observation data is synthetic and contains no personal identifiers.</w:t>
       </w:r>
     </w:p>
     <w:p>
       <w:pPr>
-        <w:pStyle w:val="ListBullet"/>
-        <w:spacing w:after="60"/>
+        <w:spacing w:before="0" w:after="80" w:line="280" w:lineRule="auto"/>
+        <w:numPr>
+          <w:ilvl w:val="0"/>
+          <w:numId w:val="11"/>
+        </w:numPr>
       </w:pPr>
       <w:r>
         <w:rPr>
-          <w:rFonts w:ascii="Aptos" w:hAnsi="Aptos"/>
-          <w:color w:val="1F3742"/>
-          <w:sz w:val="21"/>
+          <w:rFonts w:ascii="Calibri" w:hAnsi="Calibri" w:eastAsia="Calibri"/>
+          <w:color w:val="243746"/>
+          <w:sz w:val="22"/>
         </w:rPr>
-        <w:t>Status is explained with words and symbols, not colour alone.</w:t>
+        <w:t>OBIS context displays source and version information.</w:t>
       </w:r>
     </w:p>
     <w:p>
       <w:pPr>
-        <w:pStyle w:val="ListBullet"/>
-        <w:spacing w:after="60"/>
+        <w:spacing w:before="0" w:after="80" w:line="280" w:lineRule="auto"/>
+        <w:numPr>
+          <w:ilvl w:val="0"/>
+          <w:numId w:val="11"/>
+        </w:numPr>
       </w:pPr>
       <w:r>
         <w:rPr>
-          <w:rFonts w:ascii="Aptos" w:hAnsi="Aptos"/>
-          <w:color w:val="1F3742"/>
-          <w:sz w:val="21"/>
+          <w:rFonts w:ascii="Calibri" w:hAnsi="Calibri" w:eastAsia="Calibri"/>
+          <w:color w:val="243746"/>
+          <w:sz w:val="22"/>
         </w:rPr>
-        <w:t>The map has an accessible list fallback.</w:t>
+        <w:t>Exact sensitive species locations are not exposed.</w:t>
       </w:r>
     </w:p>
     <w:p>
       <w:pPr>
-        <w:pStyle w:val="ListBullet"/>
-        <w:spacing w:after="60"/>
+        <w:spacing w:before="0" w:after="80" w:line="280" w:lineRule="auto"/>
+        <w:numPr>
+          <w:ilvl w:val="0"/>
+          <w:numId w:val="11"/>
+        </w:numPr>
       </w:pPr>
       <w:r>
         <w:rPr>
-          <w:rFonts w:ascii="Aptos" w:hAnsi="Aptos"/>
-          <w:color w:val="1F3742"/>
-          <w:sz w:val="21"/>
+          <w:rFonts w:ascii="Calibri" w:hAnsi="Calibri" w:eastAsia="Calibri"/>
+          <w:color w:val="243746"/>
+          <w:sz w:val="22"/>
         </w:rPr>
-        <w:t>The 375px layout has no horizontal overflow.</w:t>
+        <w:t>Category and priority wording is clearly illustrative and rule-based.</w:t>
       </w:r>
     </w:p>
     <w:p>
       <w:pPr>
-        <w:pStyle w:val="ListBullet"/>
-        <w:spacing w:after="60"/>
+        <w:spacing w:before="0" w:after="80" w:line="280" w:lineRule="auto"/>
+        <w:numPr>
+          <w:ilvl w:val="0"/>
+          <w:numId w:val="11"/>
+        </w:numPr>
       </w:pPr>
       <w:r>
         <w:rPr>
-          <w:rFonts w:ascii="Aptos" w:hAnsi="Aptos"/>
-          <w:color w:val="1F3742"/>
-          <w:sz w:val="21"/>
+          <w:rFonts w:ascii="Calibri" w:hAnsi="Calibri" w:eastAsia="Calibri"/>
+          <w:color w:val="243746"/>
+          <w:sz w:val="22"/>
         </w:rPr>
-        <w:t>Error text is announced near the control that needs correction.</w:t>
+        <w:t>No screen claims to prove a pollution source, species identity or ecological impact.</w:t>
+      </w:r>
+    </w:p>
+    <w:p>
+      <w:pPr>
+        <w:spacing w:before="0" w:after="80" w:line="280" w:lineRule="auto"/>
+        <w:numPr>
+          <w:ilvl w:val="0"/>
+          <w:numId w:val="11"/>
+        </w:numPr>
+      </w:pPr>
+      <w:r>
+        <w:rPr>
+          <w:rFonts w:ascii="Calibri" w:hAnsi="Calibri" w:eastAsia="Calibri"/>
+          <w:color w:val="243746"/>
+          <w:sz w:val="22"/>
+        </w:rPr>
+        <w:t>No screen directs enforcement or presents an official clean-up priority.</w:t>
+      </w:r>
+    </w:p>
+    <w:p>
+      <w:pPr>
+        <w:spacing w:before="0" w:after="80" w:line="280" w:lineRule="auto"/>
+        <w:numPr>
+          <w:ilvl w:val="0"/>
+          <w:numId w:val="11"/>
+        </w:numPr>
+      </w:pPr>
+      <w:r>
+        <w:rPr>
+          <w:rFonts w:ascii="Calibri" w:hAnsi="Calibri" w:eastAsia="Calibri"/>
+          <w:color w:val="243746"/>
+          <w:sz w:val="22"/>
+        </w:rPr>
+        <w:t>External AI, computer vision and real raw-file upload remain disabled.</w:t>
       </w:r>
     </w:p>
     <w:p>
@@ -341,20 +1996,109 @@
         <w:pStyle w:val="Heading1"/>
       </w:pPr>
       <w:r>
-        <w:t>Deployment evidence</w:t>
+        <w:t>Deployment and evidence checks</w:t>
       </w:r>
     </w:p>
     <w:p>
       <w:pPr>
-        <w:spacing w:after="120" w:line="259" w:lineRule="auto"/>
+        <w:spacing w:before="0" w:after="80" w:line="280" w:lineRule="auto"/>
+        <w:numPr>
+          <w:ilvl w:val="0"/>
+          <w:numId w:val="11"/>
+        </w:numPr>
       </w:pPr>
       <w:r>
         <w:rPr>
-          <w:rFonts w:ascii="Aptos" w:hAnsi="Aptos"/>
-          <w:color w:val="1F3742"/>
-          <w:sz w:val="21"/>
+          <w:rFonts w:ascii="Calibri" w:hAnsi="Calibri" w:eastAsia="Calibri"/>
+          <w:color w:val="243746"/>
+          <w:sz w:val="22"/>
         </w:rPr>
-        <w:t>Record the date, GitHub commit, Render URL, test values, API response status and one screenshot in `05 Evidence`. The current service URLs are listed in `TEAM04_Marine_Project_Information.md`.</w:t>
+        <w:t>The frontend calls the intended Render API URL.</w:t>
+      </w:r>
+    </w:p>
+    <w:p>
+      <w:pPr>
+        <w:spacing w:before="0" w:after="80" w:line="280" w:lineRule="auto"/>
+        <w:numPr>
+          <w:ilvl w:val="0"/>
+          <w:numId w:val="11"/>
+        </w:numPr>
+      </w:pPr>
+      <w:r>
+        <w:rPr>
+          <w:rFonts w:ascii="Calibri" w:hAnsi="Calibri" w:eastAsia="Calibri"/>
+          <w:color w:val="243746"/>
+          <w:sz w:val="22"/>
+        </w:rPr>
+        <w:t>Both services use HTTPS and no mixed-content error appears.</w:t>
+      </w:r>
+    </w:p>
+    <w:p>
+      <w:pPr>
+        <w:spacing w:before="0" w:after="80" w:line="280" w:lineRule="auto"/>
+        <w:numPr>
+          <w:ilvl w:val="0"/>
+          <w:numId w:val="11"/>
+        </w:numPr>
+      </w:pPr>
+      <w:r>
+        <w:rPr>
+          <w:rFonts w:ascii="Calibri" w:hAnsi="Calibri" w:eastAsia="Calibri"/>
+          <w:color w:val="243746"/>
+          <w:sz w:val="22"/>
+        </w:rPr>
+        <w:t>A cold-start or temporary API delay produces a recoverable experience.</w:t>
+      </w:r>
+    </w:p>
+    <w:p>
+      <w:pPr>
+        <w:spacing w:before="0" w:after="80" w:line="280" w:lineRule="auto"/>
+        <w:numPr>
+          <w:ilvl w:val="0"/>
+          <w:numId w:val="11"/>
+        </w:numPr>
+      </w:pPr>
+      <w:r>
+        <w:rPr>
+          <w:rFonts w:ascii="Calibri" w:hAnsi="Calibri" w:eastAsia="Calibri"/>
+          <w:color w:val="243746"/>
+          <w:sz w:val="22"/>
+        </w:rPr>
+        <w:t>One screenshot shows the completed result and visible boundary wording.</w:t>
+      </w:r>
+    </w:p>
+    <w:p>
+      <w:pPr>
+        <w:spacing w:before="0" w:after="80" w:line="280" w:lineRule="auto"/>
+        <w:numPr>
+          <w:ilvl w:val="0"/>
+          <w:numId w:val="11"/>
+        </w:numPr>
+      </w:pPr>
+      <w:r>
+        <w:rPr>
+          <w:rFonts w:ascii="Calibri" w:hAnsi="Calibri" w:eastAsia="Calibri"/>
+          <w:color w:val="243746"/>
+          <w:sz w:val="22"/>
+        </w:rPr>
+        <w:t>The PGP records commit, test time, URLs, synthetic inputs, response status and known limitations.</w:t>
+      </w:r>
+    </w:p>
+    <w:p>
+      <w:pPr>
+        <w:spacing w:before="0" w:after="80" w:line="280" w:lineRule="auto"/>
+        <w:numPr>
+          <w:ilvl w:val="0"/>
+          <w:numId w:val="11"/>
+        </w:numPr>
+      </w:pPr>
+      <w:r>
+        <w:rPr>
+          <w:rFonts w:ascii="Calibri" w:hAnsi="Calibri" w:eastAsia="Calibri"/>
+          <w:color w:val="243746"/>
+          <w:sz w:val="22"/>
+        </w:rPr>
+        <w:t>The release owner records any failed item with an owner and next action.</w:t>
       </w:r>
     </w:p>
     <w:p>
@@ -362,27 +2106,127 @@
         <w:pStyle w:val="Heading1"/>
       </w:pPr>
       <w:r>
-        <w:t>Known limitations</w:t>
+        <w:t>Known limitations to disclose</w:t>
       </w:r>
     </w:p>
     <w:p>
       <w:pPr>
-        <w:spacing w:after="120" w:line="259" w:lineRule="auto"/>
+        <w:spacing w:before="0" w:after="120" w:line="264" w:lineRule="auto"/>
       </w:pPr>
       <w:r>
         <w:rPr>
-          <w:rFonts w:ascii="Aptos" w:hAnsi="Aptos"/>
-          <w:color w:val="1F3742"/>
-          <w:sz w:val="21"/>
+          <w:rFonts w:ascii="Calibri" w:hAnsi="Calibri" w:eastAsia="Calibri"/>
+          <w:color w:val="243746"/>
+          <w:sz w:val="22"/>
         </w:rPr>
-        <w:t>The category and priority rules are illustrative. The demo does not establish pollution source, species identity, ecological impact or enforcement priority. External AI/CV and real data remain disabled.</w:t>
+        <w:t>The first release uses a static OBIS sample and deterministic illustrative rules. It does not provide real-time monitoring, verified species identification, pollution-source attribution, ecological assessment, automated clean-up scheduling or enforcement support. Passing this checklist supports a course demonstration, not production readiness.</w:t>
       </w:r>
+    </w:p>
+    <w:p>
+      <w:pPr>
+        <w:pStyle w:val="Heading1"/>
+      </w:pPr>
+      <w:r>
+        <w:t>Project spaces</w:t>
+      </w:r>
+    </w:p>
+    <w:p>
+      <w:pPr>
+        <w:spacing w:before="0" w:after="120" w:line="264" w:lineRule="auto"/>
+      </w:pPr>
+      <w:hyperlink r:id="rId13">
+        <w:r>
+          <w:rPr>
+            <w:rFonts w:ascii="Calibri" w:hAnsi="Calibri"/>
+            <w:color w:val="0563C1"/>
+            <w:u w:val="single"/>
+            <w:sz w:val="22"/>
+          </w:rPr>
+          <w:t>GitHub</w:t>
+        </w:r>
+      </w:hyperlink>
+      <w:r>
+        <w:rPr>
+          <w:rFonts w:ascii="Calibri" w:hAnsi="Calibri" w:eastAsia="Calibri"/>
+          <w:color w:val="243746"/>
+          <w:sz w:val="22"/>
+        </w:rPr>
+        <w:t xml:space="preserve"> | </w:t>
+      </w:r>
+      <w:hyperlink r:id="rId11">
+        <w:r>
+          <w:rPr>
+            <w:rFonts w:ascii="Calibri" w:hAnsi="Calibri"/>
+            <w:color w:val="0563C1"/>
+            <w:u w:val="single"/>
+            <w:sz w:val="22"/>
+          </w:rPr>
+          <w:t>Render frontend</w:t>
+        </w:r>
+      </w:hyperlink>
+      <w:r>
+        <w:rPr>
+          <w:rFonts w:ascii="Calibri" w:hAnsi="Calibri" w:eastAsia="Calibri"/>
+          <w:color w:val="243746"/>
+          <w:sz w:val="22"/>
+        </w:rPr>
+        <w:t xml:space="preserve"> | </w:t>
+      </w:r>
+      <w:hyperlink r:id="rId12">
+        <w:r>
+          <w:rPr>
+            <w:rFonts w:ascii="Calibri" w:hAnsi="Calibri"/>
+            <w:color w:val="0563C1"/>
+            <w:u w:val="single"/>
+            <w:sz w:val="22"/>
+          </w:rPr>
+          <w:t>Render API</w:t>
+        </w:r>
+      </w:hyperlink>
+      <w:r>
+        <w:rPr>
+          <w:rFonts w:ascii="Calibri" w:hAnsi="Calibri" w:eastAsia="Calibri"/>
+          <w:color w:val="243746"/>
+          <w:sz w:val="22"/>
+        </w:rPr>
+        <w:t xml:space="preserve"> | </w:t>
+      </w:r>
+      <w:hyperlink r:id="rId14">
+        <w:r>
+          <w:rPr>
+            <w:rFonts w:ascii="Calibri" w:hAnsi="Calibri"/>
+            <w:color w:val="0563C1"/>
+            <w:u w:val="single"/>
+            <w:sz w:val="22"/>
+          </w:rPr>
+          <w:t>Drive PGP</w:t>
+        </w:r>
+      </w:hyperlink>
+      <w:r>
+        <w:rPr>
+          <w:rFonts w:ascii="Calibri" w:hAnsi="Calibri" w:eastAsia="Calibri"/>
+          <w:color w:val="243746"/>
+          <w:sz w:val="22"/>
+        </w:rPr>
+        <w:t xml:space="preserve"> | </w:t>
+      </w:r>
+      <w:hyperlink r:id="rId15">
+        <w:r>
+          <w:rPr>
+            <w:rFonts w:ascii="Calibri" w:hAnsi="Calibri"/>
+            <w:color w:val="0563C1"/>
+            <w:u w:val="single"/>
+            <w:sz w:val="22"/>
+          </w:rPr>
+          <w:t>Miro</w:t>
+        </w:r>
+      </w:hyperlink>
     </w:p>
     <w:sectPr>
       <w:headerReference w:type="default" r:id="rId9"/>
       <w:footerReference w:type="default" r:id="rId10"/>
       <w:pgSz w:w="12240" w:h="15840"/>
-      <w:pgMar w:top="893" w:right="1037" w:bottom="835" w:left="1037" w:header="720" w:footer="720" w:gutter="0"/>
+      <w:pgMar w:top="1440" w:right="1440" w:bottom="1440" w:left="1440" w:header="648" w:footer="648" w:gutter="0"/>
       <w:cols w:space="720"/>
       <w:docGrid w:linePitch="360"/>
     </w:sectPr>
@@ -395,15 +2239,39 @@
   <w:p>
     <w:pPr>
       <w:pStyle w:val="Footer"/>
-      <w:jc w:val="center"/>
+      <w:tabs>
+        <w:tab w:pos="9360" w:val="right"/>
+      </w:tabs>
+      <w:spacing w:before="0" w:after="0"/>
     </w:pPr>
     <w:r>
       <w:rPr>
-        <w:rFonts w:ascii="Aptos" w:hAnsi="Aptos"/>
-        <w:color w:val="64787D"/>
+        <w:rFonts w:ascii="Calibri" w:hAnsi="Calibri" w:eastAsia="Calibri"/>
+        <w:color w:val="61737C"/>
         <w:sz w:val="16"/>
       </w:rPr>
-      <w:t>FIT5120 2026 S2  •  Synthetic/public data boundary</w:t>
+      <w:t>VERSION 1.0 | 14 AUGUST 2026 | SYNTHETIC/PUBLIC DATA | NON-ENFORCEMENT DEMO</w:t>
+    </w:r>
+    <w:r>
+      <w:rPr>
+        <w:rFonts w:ascii="Calibri" w:hAnsi="Calibri" w:eastAsia="Calibri"/>
+        <w:color w:val="61737C"/>
+        <w:sz w:val="16"/>
+      </w:rPr>
+      <w:tab/>
+      <w:t xml:space="preserve">PAGE </w:t>
+    </w:r>
+    <w:r>
+      <w:rPr>
+        <w:rFonts w:ascii="Calibri" w:hAnsi="Calibri" w:eastAsia="Calibri"/>
+        <w:color w:val="61737C"/>
+        <w:sz w:val="16"/>
+      </w:rPr>
+      <w:fldChar w:fldCharType="begin"/>
+      <w:instrText xml:space="preserve"> PAGE </w:instrText>
+      <w:fldChar w:fldCharType="separate"/>
+      <w:t>1</w:t>
+      <w:fldChar w:fldCharType="end"/>
     </w:r>
   </w:p>
 </w:ftr>
@@ -414,16 +2282,17 @@
   <w:p>
     <w:pPr>
       <w:pStyle w:val="Header"/>
+      <w:spacing w:after="0"/>
       <w:jc w:val="right"/>
     </w:pPr>
     <w:r>
       <w:rPr>
-        <w:rFonts w:ascii="Aptos" w:hAnsi="Aptos"/>
-        <w:b/>
-        <w:color w:val="147D85"/>
+        <w:rFonts w:ascii="Calibri" w:hAnsi="Calibri" w:eastAsia="Calibri"/>
+        <w:b/>
+        <w:color w:val="0F6F73"/>
         <w:sz w:val="16"/>
       </w:rPr>
-      <w:t>TEAM 04  |  MARINE OBSERVATION MVP</w:t>
+      <w:t>TEAM 04 | MARINE OBSERVATION MVP</w:t>
     </w:r>
   </w:p>
 </w:hdr>
@@ -628,6 +2497,72 @@
   </w:num>
   <w:num w:numId="9">
     <w:abstractNumId w:val="0"/>
+  </w:num>
+  <w:abstractNum w:abstractNumId="9">
+    <w:multiLevelType w:val="singleLevel"/>
+    <w:lvl w:ilvl="0">
+      <w:start w:val="1"/>
+      <w:numFmt w:val="bullet"/>
+      <w:lvlText w:val="•"/>
+      <w:lvlJc w:val="left"/>
+      <w:suff w:val="tab"/>
+      <w:pPr>
+        <w:tabs>
+          <w:tab w:val="num" w:pos="720"/>
+        </w:tabs>
+        <w:ind w:left="720" w:hanging="360"/>
+      </w:pPr>
+      <w:rPr>
+        <w:rFonts w:ascii="Symbol" w:hAnsi="Symbol"/>
+      </w:rPr>
+    </w:lvl>
+  </w:abstractNum>
+  <w:abstractNum w:abstractNumId="10">
+    <w:multiLevelType w:val="singleLevel"/>
+    <w:lvl w:ilvl="0">
+      <w:start w:val="1"/>
+      <w:numFmt w:val="bullet"/>
+      <w:lvlText w:val="☐"/>
+      <w:lvlJc w:val="left"/>
+      <w:suff w:val="tab"/>
+      <w:pPr>
+        <w:tabs>
+          <w:tab w:val="num" w:pos="720"/>
+        </w:tabs>
+        <w:ind w:left="720" w:hanging="360"/>
+      </w:pPr>
+      <w:rPr>
+        <w:rFonts w:ascii="Segoe UI Symbol" w:hAnsi="Segoe UI Symbol"/>
+      </w:rPr>
+    </w:lvl>
+  </w:abstractNum>
+  <w:abstractNum w:abstractNumId="11">
+    <w:multiLevelType w:val="singleLevel"/>
+    <w:lvl w:ilvl="0">
+      <w:start w:val="1"/>
+      <w:numFmt w:val="decimal"/>
+      <w:lvlText w:val="%1."/>
+      <w:lvlJc w:val="left"/>
+      <w:suff w:val="tab"/>
+      <w:pPr>
+        <w:tabs>
+          <w:tab w:val="num" w:pos="720"/>
+        </w:tabs>
+        <w:ind w:left="720" w:hanging="360"/>
+      </w:pPr>
+      <w:rPr>
+        <w:rFonts w:ascii="Calibri" w:hAnsi="Calibri"/>
+      </w:rPr>
+    </w:lvl>
+  </w:abstractNum>
+  <w:num w:numId="10">
+    <w:abstractNumId w:val="9"/>
+  </w:num>
+  <w:num w:numId="11">
+    <w:abstractNumId w:val="10"/>
+  </w:num>
+  <w:num w:numId="12">
+    <w:abstractNumId w:val="11"/>
   </w:num>
 </w:numbering>
 </file>
@@ -792,9 +2727,14 @@
     <w:name w:val="Normal"/>
     <w:qFormat/>
     <w:rsid w:val="00FC693F"/>
+    <w:pPr>
+      <w:spacing w:before="0" w:after="120" w:line="264" w:lineRule="auto"/>
+    </w:pPr>
     <w:rPr>
-      <w:rFonts w:ascii="Aptos" w:hAnsi="Aptos"/>
-      <w:sz w:val="21"/>
+      <w:rFonts w:ascii="Calibri" w:hAnsi="Calibri" w:eastAsia="Calibri"/>
+      <w:b w:val="0"/>
+      <w:color w:val="243746"/>
+      <w:sz w:val="22"/>
     </w:rPr>
   </w:style>
   <w:style w:type="paragraph" w:styleId="Header">
@@ -852,15 +2792,15 @@
     <w:pPr>
       <w:keepNext/>
       <w:keepLines/>
-      <w:spacing w:before="480" w:after="0"/>
+      <w:spacing w:before="320" w:after="160"/>
       <w:outlineLvl w:val="0"/>
     </w:pPr>
     <w:rPr>
-      <w:rFonts w:asciiTheme="majorHAnsi" w:eastAsiaTheme="majorEastAsia" w:hAnsiTheme="majorHAnsi" w:cstheme="majorBidi" w:ascii="Aptos Display" w:hAnsi="Aptos Display"/>
+      <w:rFonts w:asciiTheme="majorHAnsi" w:eastAsiaTheme="majorEastAsia" w:hAnsiTheme="majorHAnsi" w:cstheme="majorBidi" w:ascii="Calibri" w:hAnsi="Calibri" w:eastAsia="Calibri"/>
       <w:b/>
       <w:bCs/>
-      <w:color w:val="147D85"/>
-      <w:sz w:val="34"/>
+      <w:color w:val="0F6F73"/>
+      <w:sz w:val="32"/>
       <w:szCs w:val="28"/>
     </w:rPr>
   </w:style>
@@ -876,14 +2816,14 @@
     <w:pPr>
       <w:keepNext/>
       <w:keepLines/>
-      <w:spacing w:before="200" w:after="0"/>
+      <w:spacing w:before="240" w:after="120"/>
       <w:outlineLvl w:val="1"/>
     </w:pPr>
     <w:rPr>
-      <w:rFonts w:asciiTheme="majorHAnsi" w:eastAsiaTheme="majorEastAsia" w:hAnsiTheme="majorHAnsi" w:cstheme="majorBidi" w:ascii="Aptos Display" w:hAnsi="Aptos Display"/>
+      <w:rFonts w:asciiTheme="majorHAnsi" w:eastAsiaTheme="majorEastAsia" w:hAnsiTheme="majorHAnsi" w:cstheme="majorBidi" w:ascii="Calibri" w:hAnsi="Calibri" w:eastAsia="Calibri"/>
       <w:b/>
       <w:bCs/>
-      <w:color w:val="2B6771"/>
+      <w:color w:val="183B56"/>
       <w:sz w:val="26"/>
       <w:szCs w:val="26"/>
     </w:rPr>
@@ -900,15 +2840,15 @@
     <w:pPr>
       <w:keepNext/>
       <w:keepLines/>
-      <w:spacing w:before="200" w:after="0"/>
+      <w:spacing w:before="160" w:after="80"/>
       <w:outlineLvl w:val="2"/>
     </w:pPr>
     <w:rPr>
-      <w:rFonts w:asciiTheme="majorHAnsi" w:eastAsiaTheme="majorEastAsia" w:hAnsiTheme="majorHAnsi" w:cstheme="majorBidi" w:ascii="Aptos Display" w:hAnsi="Aptos Display"/>
+      <w:rFonts w:asciiTheme="majorHAnsi" w:eastAsiaTheme="majorEastAsia" w:hAnsiTheme="majorHAnsi" w:cstheme="majorBidi" w:ascii="Calibri" w:hAnsi="Calibri" w:eastAsia="Calibri"/>
       <w:b/>
       <w:bCs/>
-      <w:color w:val="2B6771"/>
-      <w:sz w:val="22"/>
+      <w:color w:val="183B56"/>
+      <w:sz w:val="24"/>
     </w:rPr>
   </w:style>
   <w:style w:type="paragraph" w:styleId="Heading4">
@@ -1139,19 +3079,20 @@
     <w:qFormat/>
     <w:rsid w:val="00FC693F"/>
     <w:pPr>
+      <w:keepNext/>
       <w:pBdr>
         <w:bottom w:val="single" w:sz="8" w:space="4" w:color="4F81BD" w:themeColor="accent1"/>
       </w:pBdr>
-      <w:spacing w:after="300" w:line="240" w:lineRule="auto"/>
+      <w:spacing w:after="120" w:line="240" w:lineRule="auto" w:before="0"/>
       <w:contextualSpacing/>
     </w:pPr>
     <w:rPr>
-      <w:rFonts w:asciiTheme="majorHAnsi" w:eastAsiaTheme="majorEastAsia" w:hAnsiTheme="majorHAnsi" w:cstheme="majorBidi" w:ascii="Aptos Display" w:hAnsi="Aptos Display"/>
+      <w:rFonts w:asciiTheme="majorHAnsi" w:eastAsiaTheme="majorEastAsia" w:hAnsiTheme="majorHAnsi" w:cstheme="majorBidi" w:ascii="Calibri" w:hAnsi="Calibri" w:eastAsia="Calibri"/>
       <w:b/>
-      <w:color w:val="147D85"/>
+      <w:color w:val="183B56"/>
       <w:spacing w:val="5"/>
       <w:kern w:val="28"/>
-      <w:sz w:val="48"/>
+      <w:sz w:val="52"/>
       <w:szCs w:val="52"/>
     </w:rPr>
   </w:style>

</xml_diff>

<commit_message>
feat: switch project to DiveSafe MY
</commit_message>
<xml_diff>
--- a/deliverables/Marine_MVP_QA_and_Deployment_Checklist.docx
+++ b/deliverables/Marine_MVP_QA_and_Deployment_Checklist.docx
@@ -14,7 +14,7 @@
           <w:color w:val="0F6F73"/>
           <w:sz w:val="18"/>
         </w:rPr>
-        <w:t>TEAM 04 | MARINE OBSERVATION MVP</w:t>
+        <w:t>TEAM 04 | DIVESAFE MY</w:t>
       </w:r>
     </w:p>
     <w:p>
@@ -22,51 +22,21 @@
         <w:pStyle w:val="Title"/>
       </w:pPr>
       <w:r>
-        <w:t>Marine MVP QA and Deployment Checklist</w:t>
+        <w:t>DiveSafe MY QA and Deployment Checklist</w:t>
       </w:r>
     </w:p>
     <w:p>
       <w:pPr>
-        <w:spacing w:before="0" w:after="60" w:line="252" w:lineRule="auto"/>
+        <w:spacing w:before="0" w:after="120" w:line="264" w:lineRule="auto"/>
       </w:pPr>
       <w:r>
         <w:rPr>
           <w:rFonts w:ascii="Calibri" w:hAnsi="Calibri" w:eastAsia="Calibri"/>
           <w:b/>
-          <w:color w:val="183B56"/>
-          <w:sz w:val="19"/>
+          <w:color w:val="243746"/>
+          <w:sz w:val="22"/>
         </w:rPr>
-        <w:t xml:space="preserve">Document control: </w:t>
-      </w:r>
-      <w:r>
-        <w:rPr>
-          <w:rFonts w:ascii="Calibri" w:hAnsi="Calibri" w:eastAsia="Calibri"/>
-          <w:color w:val="61737C"/>
-          <w:sz w:val="19"/>
-        </w:rPr>
-        <w:t>Version 1.0 | 14 August 2026 | Release evidence template</w:t>
-      </w:r>
-    </w:p>
-    <w:p>
-      <w:pPr>
-        <w:spacing w:before="0" w:after="60" w:line="252" w:lineRule="auto"/>
-      </w:pPr>
-      <w:r>
-        <w:rPr>
-          <w:rFonts w:ascii="Calibri" w:hAnsi="Calibri" w:eastAsia="Calibri"/>
-          <w:b/>
-          <w:color w:val="183B56"/>
-          <w:sz w:val="19"/>
-        </w:rPr>
-        <w:t xml:space="preserve">Audience: </w:t>
-      </w:r>
-      <w:r>
-        <w:rPr>
-          <w:rFonts w:ascii="Calibri" w:hAnsi="Calibri" w:eastAsia="Calibri"/>
-          <w:color w:val="61737C"/>
-          <w:sz w:val="19"/>
-        </w:rPr>
-        <w:t>Testers, integrators, demonstrators and release reviewers</w:t>
+        <w:t>Version 2.0 | 15 August 2026</w:t>
       </w:r>
     </w:p>
     <w:p>
@@ -82,19 +52,29 @@
       <w:r>
         <w:rPr>
           <w:rFonts w:ascii="Calibri" w:hAnsi="Calibri" w:eastAsia="Calibri"/>
-          <w:b/>
           <w:color w:val="243746"/>
           <w:sz w:val="21"/>
         </w:rPr>
-        <w:t>Safety boundary:</w:t>
+        <w:t>Test with synthetic values only. A demo suggestion is not a verified species</w:t>
       </w:r>
+    </w:p>
+    <w:p>
+      <w:pPr>
+        <w:keepLines/>
+        <w:spacing w:before="100" w:after="180" w:line="264" w:lineRule="auto"/>
+        <w:ind w:left="230" w:right="115"/>
+        <w:shd w:fill="EEF6F5"/>
+        <w:pBdr>
+          <w:left w:val="single" w:sz="14" w:space="8" w:color="0F6F73"/>
+        </w:pBdr>
+      </w:pPr>
       <w:r>
         <w:rPr>
           <w:rFonts w:ascii="Calibri" w:hAnsi="Calibri" w:eastAsia="Calibri"/>
           <w:color w:val="243746"/>
           <w:sz w:val="21"/>
         </w:rPr>
-        <w:t xml:space="preserve"> Use synthetic or public data only. This MVP is a demonstration and learning tool. It does not prove a pollution source, verify species identity, establish ecological impact, or direct environmental enforcement or official clean-up action.</w:t>
+        <w:t>result or legal advice.</w:t>
       </w:r>
     </w:p>
     <w:p>
@@ -103,19 +83,6 @@
       </w:pPr>
       <w:r>
         <w:t>Test record</w:t>
-      </w:r>
-    </w:p>
-    <w:p>
-      <w:pPr>
-        <w:spacing w:before="0" w:after="120" w:line="264" w:lineRule="auto"/>
-      </w:pPr>
-      <w:r>
-        <w:rPr>
-          <w:rFonts w:ascii="Calibri" w:hAnsi="Calibri" w:eastAsia="Calibri"/>
-          <w:color w:val="243746"/>
-          <w:sz w:val="22"/>
-        </w:rPr>
-        <w:t>Complete this block for each release candidate.</w:t>
       </w:r>
     </w:p>
     <w:tbl>
@@ -228,7 +195,7 @@
                 <w:color w:val="243746"/>
                 <w:sz w:val="18"/>
               </w:rPr>
-              <w:t>Test date and time</w:t>
+              <w:t>Date and time</w:t>
             </w:r>
           </w:p>
         </w:tc>
@@ -378,7 +345,7 @@
                 <w:color w:val="243746"/>
                 <w:sz w:val="18"/>
               </w:rPr>
-              <w:t>Render frontend URL</w:t>
+              <w:t>Frontend</w:t>
             </w:r>
           </w:p>
         </w:tc>
@@ -439,7 +406,7 @@
                 <w:color w:val="243746"/>
                 <w:sz w:val="18"/>
               </w:rPr>
-              <w:t>Render API URL</w:t>
+              <w:t>API</w:t>
             </w:r>
           </w:p>
         </w:tc>
@@ -500,7 +467,7 @@
                 <w:color w:val="243746"/>
                 <w:sz w:val="18"/>
               </w:rPr>
-              <w:t>Synthetic test case</w:t>
+              <w:t>Synthetic profile/site/species</w:t>
             </w:r>
           </w:p>
         </w:tc>
@@ -550,7 +517,7 @@
                 <w:color w:val="243746"/>
                 <w:sz w:val="18"/>
               </w:rPr>
-              <w:t>Overall result</w:t>
+              <w:t>Result and limits</w:t>
             </w:r>
           </w:p>
         </w:tc>
@@ -571,14 +538,6 @@
               <w:spacing w:before="0" w:after="0" w:line="252" w:lineRule="auto"/>
             </w:pPr>
             <w:r/>
-            <w:r>
-              <w:rPr>
-                <w:rFonts w:ascii="Calibri" w:hAnsi="Calibri" w:eastAsia="Calibri"/>
-                <w:color w:val="243746"/>
-                <w:sz w:val="18"/>
-              </w:rPr>
-              <w:t>Pass / Pass with limitations / Fail</w:t>
-            </w:r>
           </w:p>
         </w:tc>
       </w:tr>
@@ -588,7 +547,7 @@
         <w:pStyle w:val="Heading1"/>
       </w:pPr>
       <w:r>
-        <w:t>Preconditions</w:t>
+        <w:t>Browser flow</w:t>
       </w:r>
     </w:p>
     <w:p>
@@ -605,23 +564,7 @@
           <w:color w:val="243746"/>
           <w:sz w:val="22"/>
         </w:rPr>
-        <w:t xml:space="preserve">The release commit is identified and matches the intended </w:t>
-      </w:r>
-      <w:r>
-        <w:rPr>
-          <w:rFonts w:ascii="Consolas" w:hAnsi="Consolas" w:eastAsia="Consolas"/>
-          <w:color w:val="183B56"/>
-          <w:sz w:val="20"/>
-        </w:rPr>
-        <w:t>main</w:t>
-      </w:r>
-      <w:r>
-        <w:rPr>
-          <w:rFonts w:ascii="Calibri" w:hAnsi="Calibri" w:eastAsia="Calibri"/>
-          <w:color w:val="243746"/>
-          <w:sz w:val="22"/>
-        </w:rPr>
-        <w:t xml:space="preserve"> state.</w:t>
+        <w:t>Profile accepts a synthetic nickname only.</w:t>
       </w:r>
     </w:p>
     <w:p>
@@ -638,32 +581,7 @@
           <w:color w:val="243746"/>
           <w:sz w:val="22"/>
         </w:rPr>
-        <w:t>The frontend and API services are reachable over HTTPS.</w:t>
-      </w:r>
-    </w:p>
-    <w:p>
-      <w:pPr>
-        <w:spacing w:before="0" w:after="80" w:line="280" w:lineRule="auto"/>
-        <w:numPr>
-          <w:ilvl w:val="0"/>
-          <w:numId w:val="11"/>
-        </w:numPr>
-      </w:pPr>
-      <w:r>
-        <w:rPr>
-          <w:rFonts w:ascii="Consolas" w:hAnsi="Consolas" w:eastAsia="Consolas"/>
-          <w:color w:val="183B56"/>
-          <w:sz w:val="20"/>
-        </w:rPr>
-        <w:t>DATABASE_URL</w:t>
-      </w:r>
-      <w:r>
-        <w:rPr>
-          <w:rFonts w:ascii="Calibri" w:hAnsi="Calibri" w:eastAsia="Calibri"/>
-          <w:color w:val="243746"/>
-          <w:sz w:val="22"/>
-        </w:rPr>
-        <w:t xml:space="preserve"> is configured privately in Render and is not visible in Git or screenshots.</w:t>
+        <w:t>Site list shows broad sites and the map has a list fallback.</w:t>
       </w:r>
     </w:p>
     <w:p>
@@ -680,7 +598,7 @@
           <w:color w:val="243746"/>
           <w:sz w:val="22"/>
         </w:rPr>
-        <w:t>The test uses invented values and a non-sensitive demonstration location.</w:t>
+        <w:t>Species directory and briefing load for the chosen site.</w:t>
       </w:r>
     </w:p>
     <w:p>
@@ -697,15 +615,7 @@
           <w:color w:val="243746"/>
           <w:sz w:val="22"/>
         </w:rPr>
-        <w:t>The tester has opened the browser console and can capture status codes or error evidence.</w:t>
-      </w:r>
-    </w:p>
-    <w:p>
-      <w:pPr>
-        <w:pStyle w:val="Heading1"/>
-      </w:pPr>
-      <w:r>
-        <w:t>End-to-end functional checks</w:t>
+        <w:t>Optional recognition shows a demo suggestion and asks for confirmation.</w:t>
       </w:r>
     </w:p>
     <w:p>
@@ -722,7 +632,7 @@
           <w:color w:val="243746"/>
           <w:sz w:val="22"/>
         </w:rPr>
-        <w:t>The report form accepts one supported category, area, time and valid coordinates.</w:t>
+        <w:t>Review shows the chosen site and species before submission.</w:t>
       </w:r>
     </w:p>
     <w:p>
@@ -739,36 +649,7 @@
           <w:color w:val="243746"/>
           <w:sz w:val="22"/>
         </w:rPr>
-        <w:t>The Approximate area native dropdown displays all five source-labelled</w:t>
-      </w:r>
-    </w:p>
-    <w:p>
-      <w:pPr>
-        <w:spacing w:before="0" w:after="120" w:line="264" w:lineRule="auto"/>
-      </w:pPr>
-      <w:r>
-        <w:rPr>
-          <w:rFonts w:ascii="Calibri" w:hAnsi="Calibri" w:eastAsia="Calibri"/>
-          <w:color w:val="243746"/>
-          <w:sz w:val="22"/>
-        </w:rPr>
-        <w:t xml:space="preserve">coarse area suggestions after </w:t>
-      </w:r>
-      <w:r>
-        <w:rPr>
-          <w:rFonts w:ascii="Consolas" w:hAnsi="Consolas" w:eastAsia="Consolas"/>
-          <w:color w:val="183B56"/>
-          <w:sz w:val="20"/>
-        </w:rPr>
-        <w:t>/api/options</w:t>
-      </w:r>
-      <w:r>
-        <w:rPr>
-          <w:rFonts w:ascii="Calibri" w:hAnsi="Calibri" w:eastAsia="Calibri"/>
-          <w:color w:val="243746"/>
-          <w:sz w:val="22"/>
-        </w:rPr>
-        <w:t xml:space="preserve"> loads.</w:t>
+        <w:t>Editing a value requires a new confirmation.</w:t>
       </w:r>
     </w:p>
     <w:p>
@@ -785,7 +666,7 @@
           <w:color w:val="243746"/>
           <w:sz w:val="22"/>
         </w:rPr>
-        <w:t>Optional notes and a safe HTTPS image URL behave as documented.</w:t>
+        <w:t>Confirmed sighting reaches the result page and keeps the safe boundary text.</w:t>
       </w:r>
     </w:p>
     <w:p>
@@ -802,7 +683,7 @@
           <w:color w:val="243746"/>
           <w:sz w:val="22"/>
         </w:rPr>
-        <w:t>Review displays every entered value and provides a clear edit action.</w:t>
+        <w:t>Collection and badge update only after a sighting is saved.</w:t>
       </w:r>
     </w:p>
     <w:p>
@@ -819,7 +700,7 @@
           <w:color w:val="243746"/>
           <w:sz w:val="22"/>
         </w:rPr>
-        <w:t>Editing a reviewed value invalidates the previous confirmation.</w:t>
+        <w:t>API failure keeps the draft and shows a retry action.</w:t>
       </w:r>
     </w:p>
     <w:p>
@@ -836,92 +717,7 @@
           <w:color w:val="243746"/>
           <w:sz w:val="22"/>
         </w:rPr>
-        <w:t>Only explicit confirmation submits the record.</w:t>
-      </w:r>
-    </w:p>
-    <w:p>
-      <w:pPr>
-        <w:spacing w:before="0" w:after="80" w:line="280" w:lineRule="auto"/>
-        <w:numPr>
-          <w:ilvl w:val="0"/>
-          <w:numId w:val="11"/>
-        </w:numPr>
-      </w:pPr>
-      <w:r>
-        <w:rPr>
-          <w:rFonts w:ascii="Calibri" w:hAnsi="Calibri" w:eastAsia="Calibri"/>
-          <w:color w:val="243746"/>
-          <w:sz w:val="22"/>
-        </w:rPr>
-        <w:t>A successful submission shows the saved observation, category result, illustrative priority and disclaimer.</w:t>
-      </w:r>
-    </w:p>
-    <w:p>
-      <w:pPr>
-        <w:spacing w:before="0" w:after="80" w:line="280" w:lineRule="auto"/>
-        <w:numPr>
-          <w:ilvl w:val="0"/>
-          <w:numId w:val="11"/>
-        </w:numPr>
-      </w:pPr>
-      <w:r>
-        <w:rPr>
-          <w:rFonts w:ascii="Calibri" w:hAnsi="Calibri" w:eastAsia="Calibri"/>
-          <w:color w:val="243746"/>
-          <w:sz w:val="22"/>
-        </w:rPr>
-        <w:t>Refreshing the observation view can read back the saved synthetic record.</w:t>
-      </w:r>
-    </w:p>
-    <w:p>
-      <w:pPr>
-        <w:spacing w:before="0" w:after="80" w:line="280" w:lineRule="auto"/>
-        <w:numPr>
-          <w:ilvl w:val="0"/>
-          <w:numId w:val="11"/>
-        </w:numPr>
-      </w:pPr>
-      <w:r>
-        <w:rPr>
-          <w:rFonts w:ascii="Calibri" w:hAnsi="Calibri" w:eastAsia="Calibri"/>
-          <w:color w:val="243746"/>
-          <w:sz w:val="22"/>
-        </w:rPr>
-        <w:t>OBIS context shows source, data version and a list fallback beside the map.</w:t>
-      </w:r>
-    </w:p>
-    <w:p>
-      <w:pPr>
-        <w:spacing w:before="0" w:after="80" w:line="280" w:lineRule="auto"/>
-        <w:numPr>
-          <w:ilvl w:val="0"/>
-          <w:numId w:val="11"/>
-        </w:numPr>
-      </w:pPr>
-      <w:r>
-        <w:rPr>
-          <w:rFonts w:ascii="Calibri" w:hAnsi="Calibri" w:eastAsia="Calibri"/>
-          <w:color w:val="243746"/>
-          <w:sz w:val="22"/>
-        </w:rPr>
-        <w:t>Sensitive context coordinates are approximate or masked.</w:t>
-      </w:r>
-    </w:p>
-    <w:p>
-      <w:pPr>
-        <w:spacing w:before="0" w:after="80" w:line="280" w:lineRule="auto"/>
-        <w:numPr>
-          <w:ilvl w:val="0"/>
-          <w:numId w:val="11"/>
-        </w:numPr>
-      </w:pPr>
-      <w:r>
-        <w:rPr>
-          <w:rFonts w:ascii="Calibri" w:hAnsi="Calibri" w:eastAsia="Calibri"/>
-          <w:color w:val="243746"/>
-          <w:sz w:val="22"/>
-        </w:rPr>
-        <w:t>API failure keeps the confirmed draft and provides a clear retry message.</w:t>
+        <w:t>Keyboard focus, labels and 375px layout work.</w:t>
       </w:r>
     </w:p>
     <w:p>
@@ -929,117 +725,7 @@
         <w:pStyle w:val="Heading1"/>
       </w:pPr>
       <w:r>
-        <w:t>Validation and error checks</w:t>
-      </w:r>
-    </w:p>
-    <w:p>
-      <w:pPr>
-        <w:spacing w:before="0" w:after="80" w:line="280" w:lineRule="auto"/>
-        <w:numPr>
-          <w:ilvl w:val="0"/>
-          <w:numId w:val="11"/>
-        </w:numPr>
-      </w:pPr>
-      <w:r>
-        <w:rPr>
-          <w:rFonts w:ascii="Calibri" w:hAnsi="Calibri" w:eastAsia="Calibri"/>
-          <w:color w:val="243746"/>
-          <w:sz w:val="22"/>
-        </w:rPr>
-        <w:t>An unsupported category is rejected with a clear message.</w:t>
-      </w:r>
-    </w:p>
-    <w:p>
-      <w:pPr>
-        <w:spacing w:before="0" w:after="80" w:line="280" w:lineRule="auto"/>
-        <w:numPr>
-          <w:ilvl w:val="0"/>
-          <w:numId w:val="11"/>
-        </w:numPr>
-      </w:pPr>
-      <w:r>
-        <w:rPr>
-          <w:rFonts w:ascii="Calibri" w:hAnsi="Calibri" w:eastAsia="Calibri"/>
-          <w:color w:val="243746"/>
-          <w:sz w:val="22"/>
-        </w:rPr>
-        <w:t>Missing required values are rejected before submission.</w:t>
-      </w:r>
-    </w:p>
-    <w:p>
-      <w:pPr>
-        <w:spacing w:before="0" w:after="80" w:line="280" w:lineRule="auto"/>
-        <w:numPr>
-          <w:ilvl w:val="0"/>
-          <w:numId w:val="11"/>
-        </w:numPr>
-      </w:pPr>
-      <w:r>
-        <w:rPr>
-          <w:rFonts w:ascii="Calibri" w:hAnsi="Calibri" w:eastAsia="Calibri"/>
-          <w:color w:val="243746"/>
-          <w:sz w:val="22"/>
-        </w:rPr>
-        <w:t>Latitude outside -90 to 90 and longitude outside -180 to 180 are rejected.</w:t>
-      </w:r>
-    </w:p>
-    <w:p>
-      <w:pPr>
-        <w:spacing w:before="0" w:after="80" w:line="280" w:lineRule="auto"/>
-        <w:numPr>
-          <w:ilvl w:val="0"/>
-          <w:numId w:val="11"/>
-        </w:numPr>
-      </w:pPr>
-      <w:r>
-        <w:rPr>
-          <w:rFonts w:ascii="Calibri" w:hAnsi="Calibri" w:eastAsia="Calibri"/>
-          <w:color w:val="243746"/>
-          <w:sz w:val="22"/>
-        </w:rPr>
-        <w:t>A future observation time, unsafe image URL or overlong notes are rejected.</w:t>
-      </w:r>
-    </w:p>
-    <w:p>
-      <w:pPr>
-        <w:spacing w:before="0" w:after="80" w:line="280" w:lineRule="auto"/>
-        <w:numPr>
-          <w:ilvl w:val="0"/>
-          <w:numId w:val="11"/>
-        </w:numPr>
-      </w:pPr>
-      <w:r>
-        <w:rPr>
-          <w:rFonts w:ascii="Calibri" w:hAnsi="Calibri" w:eastAsia="Calibri"/>
-          <w:color w:val="243746"/>
-          <w:sz w:val="22"/>
-        </w:rPr>
-        <w:t>Validation identifies the field that needs correction.</w:t>
-      </w:r>
-    </w:p>
-    <w:p>
-      <w:pPr>
-        <w:spacing w:before="0" w:after="80" w:line="280" w:lineRule="auto"/>
-        <w:numPr>
-          <w:ilvl w:val="0"/>
-          <w:numId w:val="11"/>
-        </w:numPr>
-      </w:pPr>
-      <w:r>
-        <w:rPr>
-          <w:rFonts w:ascii="Calibri" w:hAnsi="Calibri" w:eastAsia="Calibri"/>
-          <w:color w:val="243746"/>
-          <w:sz w:val="22"/>
-        </w:rPr>
-        <w:t>The interface does not display raw stack traces, database details or credentials.</w:t>
-      </w:r>
-    </w:p>
-    <w:p>
-      <w:pPr>
-        <w:pStyle w:val="Heading1"/>
-      </w:pPr>
-      <w:r>
-        <w:t>API checks</w:t>
+        <w:t>API smoke checks</w:t>
       </w:r>
     </w:p>
     <w:tbl>
@@ -1052,9 +738,8 @@
         <w:tblLayout w:type="fixed"/>
       </w:tblPr>
       <w:tblGrid>
-        <w:gridCol w:w="2250"/>
-        <w:gridCol w:w="4010"/>
-        <w:gridCol w:w="3100"/>
+        <w:gridCol w:w="2700"/>
+        <w:gridCol w:w="6660"/>
       </w:tblGrid>
       <w:tr>
         <w:trPr>
@@ -1063,7 +748,7 @@
         </w:trPr>
         <w:tc>
           <w:tcPr>
-            <w:tcW w:type="dxa" w:w="2250"/>
+            <w:tcW w:type="dxa" w:w="2700"/>
             <w:vAlign w:val="center"/>
             <w:tcMar>
               <w:top w:w="80" w:type="dxa"/>
@@ -1089,13 +774,13 @@
                 <w:color w:val="FFFFFF"/>
                 <w:sz w:val="18"/>
               </w:rPr>
-              <w:t>Check</w:t>
+              <w:t>Request</w:t>
             </w:r>
           </w:p>
         </w:tc>
         <w:tc>
           <w:tcPr>
-            <w:tcW w:type="dxa" w:w="4010"/>
+            <w:tcW w:type="dxa" w:w="6660"/>
             <w:vAlign w:val="center"/>
             <w:tcMar>
               <w:top w:w="80" w:type="dxa"/>
@@ -1121,39 +806,7 @@
                 <w:color w:val="FFFFFF"/>
                 <w:sz w:val="18"/>
               </w:rPr>
-              <w:t>Expected result</w:t>
-            </w:r>
-          </w:p>
-        </w:tc>
-        <w:tc>
-          <w:tcPr>
-            <w:tcW w:type="dxa" w:w="3100"/>
-            <w:vAlign w:val="center"/>
-            <w:tcMar>
-              <w:top w:w="80" w:type="dxa"/>
-              <w:start w:w="120" w:type="dxa"/>
-              <w:bottom w:w="80" w:type="dxa"/>
-              <w:end w:w="120" w:type="dxa"/>
-            </w:tcMar>
-            <w:shd w:fill="183B56"/>
-          </w:tcPr>
-          <w:p>
-            <w:pPr>
-              <w:spacing w:before="0" w:after="0" w:line="252" w:lineRule="auto"/>
-            </w:pPr>
-            <w:r>
-              <w:rPr>
-                <w:b/>
-              </w:rPr>
-            </w:r>
-            <w:r>
-              <w:rPr>
-                <w:rFonts w:ascii="Calibri" w:hAnsi="Calibri" w:eastAsia="Calibri"/>
-                <w:b/>
-                <w:color w:val="FFFFFF"/>
-                <w:sz w:val="18"/>
-              </w:rPr>
-              <w:t>Evidence</w:t>
+              <w:t>Expected</w:t>
             </w:r>
           </w:p>
         </w:tc>
@@ -1164,7 +817,7 @@
         </w:trPr>
         <w:tc>
           <w:tcPr>
-            <w:tcW w:type="dxa" w:w="2250"/>
+            <w:tcW w:type="dxa" w:w="2700"/>
             <w:vAlign w:val="center"/>
             <w:tcMar>
               <w:top w:w="80" w:type="dxa"/>
@@ -1191,7 +844,7 @@
         </w:tc>
         <w:tc>
           <w:tcPr>
-            <w:tcW w:type="dxa" w:w="4010"/>
+            <w:tcW w:type="dxa" w:w="6660"/>
             <w:vAlign w:val="center"/>
             <w:tcMar>
               <w:top w:w="80" w:type="dxa"/>
@@ -1212,27 +865,8 @@
                 <w:color w:val="243746"/>
                 <w:sz w:val="18"/>
               </w:rPr>
-              <w:t>HTTP 200; service, synthetic/public boundary and database mode are present</w:t>
+              <w:t>200</w:t>
             </w:r>
-          </w:p>
-        </w:tc>
-        <w:tc>
-          <w:tcPr>
-            <w:tcW w:type="dxa" w:w="3100"/>
-            <w:vAlign w:val="center"/>
-            <w:tcMar>
-              <w:top w:w="80" w:type="dxa"/>
-              <w:start w:w="120" w:type="dxa"/>
-              <w:bottom w:w="80" w:type="dxa"/>
-              <w:end w:w="120" w:type="dxa"/>
-            </w:tcMar>
-            <w:shd w:fill="EFF3F7"/>
-          </w:tcPr>
-          <w:p>
-            <w:pPr>
-              <w:spacing w:before="0" w:after="0" w:line="252" w:lineRule="auto"/>
-            </w:pPr>
-            <w:r/>
           </w:p>
         </w:tc>
       </w:tr>
@@ -1242,7 +876,7 @@
         </w:trPr>
         <w:tc>
           <w:tcPr>
-            <w:tcW w:type="dxa" w:w="2250"/>
+            <w:tcW w:type="dxa" w:w="2700"/>
             <w:vAlign w:val="center"/>
             <w:tcMar>
               <w:top w:w="80" w:type="dxa"/>
@@ -1262,13 +896,13 @@
                 <w:color w:val="183B56"/>
                 <w:sz w:val="18"/>
               </w:rPr>
-              <w:t>GET /api/context</w:t>
+              <w:t>GET /api/dive-sites</w:t>
             </w:r>
           </w:p>
         </w:tc>
         <w:tc>
           <w:tcPr>
-            <w:tcW w:type="dxa" w:w="4010"/>
+            <w:tcW w:type="dxa" w:w="6660"/>
             <w:vAlign w:val="center"/>
             <w:tcMar>
               <w:top w:w="80" w:type="dxa"/>
@@ -1288,26 +922,8 @@
                 <w:color w:val="243746"/>
                 <w:sz w:val="18"/>
               </w:rPr>
-              <w:t>HTTP 200; OBIS source and data version are present</w:t>
+              <w:t>200, coarse locations</w:t>
             </w:r>
-          </w:p>
-        </w:tc>
-        <w:tc>
-          <w:tcPr>
-            <w:tcW w:type="dxa" w:w="3100"/>
-            <w:vAlign w:val="center"/>
-            <w:tcMar>
-              <w:top w:w="80" w:type="dxa"/>
-              <w:start w:w="120" w:type="dxa"/>
-              <w:bottom w:w="80" w:type="dxa"/>
-              <w:end w:w="120" w:type="dxa"/>
-            </w:tcMar>
-          </w:tcPr>
-          <w:p>
-            <w:pPr>
-              <w:spacing w:before="0" w:after="0" w:line="252" w:lineRule="auto"/>
-            </w:pPr>
-            <w:r/>
           </w:p>
         </w:tc>
       </w:tr>
@@ -1317,7 +933,7 @@
         </w:trPr>
         <w:tc>
           <w:tcPr>
-            <w:tcW w:type="dxa" w:w="2250"/>
+            <w:tcW w:type="dxa" w:w="2700"/>
             <w:vAlign w:val="center"/>
             <w:tcMar>
               <w:top w:w="80" w:type="dxa"/>
@@ -1338,13 +954,13 @@
                 <w:color w:val="183B56"/>
                 <w:sz w:val="18"/>
               </w:rPr>
-              <w:t>GET /api/options</w:t>
+              <w:t>GET /api/species</w:t>
             </w:r>
           </w:p>
         </w:tc>
         <w:tc>
           <w:tcPr>
-            <w:tcW w:type="dxa" w:w="4010"/>
+            <w:tcW w:type="dxa" w:w="6660"/>
             <w:vAlign w:val="center"/>
             <w:tcMar>
               <w:top w:w="80" w:type="dxa"/>
@@ -1365,27 +981,8 @@
                 <w:color w:val="243746"/>
                 <w:sz w:val="18"/>
               </w:rPr>
-              <w:t>HTTP 200; catalogue version and five area labels are present</w:t>
+              <w:t>200, source/version present</w:t>
             </w:r>
-          </w:p>
-        </w:tc>
-        <w:tc>
-          <w:tcPr>
-            <w:tcW w:type="dxa" w:w="3100"/>
-            <w:vAlign w:val="center"/>
-            <w:tcMar>
-              <w:top w:w="80" w:type="dxa"/>
-              <w:start w:w="120" w:type="dxa"/>
-              <w:bottom w:w="80" w:type="dxa"/>
-              <w:end w:w="120" w:type="dxa"/>
-            </w:tcMar>
-            <w:shd w:fill="EFF3F7"/>
-          </w:tcPr>
-          <w:p>
-            <w:pPr>
-              <w:spacing w:before="0" w:after="0" w:line="252" w:lineRule="auto"/>
-            </w:pPr>
-            <w:r/>
           </w:p>
         </w:tc>
       </w:tr>
@@ -1395,7 +992,33 @@
         </w:trPr>
         <w:tc>
           <w:tcPr>
-            <w:tcW w:type="dxa" w:w="2250"/>
+            <w:tcW w:type="dxa" w:w="2700"/>
+            <w:vAlign w:val="center"/>
+            <w:tcMar>
+              <w:top w:w="80" w:type="dxa"/>
+              <w:start w:w="120" w:type="dxa"/>
+              <w:bottom w:w="80" w:type="dxa"/>
+              <w:end w:w="120" w:type="dxa"/>
+            </w:tcMar>
+          </w:tcPr>
+          <w:p>
+            <w:pPr>
+              <w:spacing w:before="0" w:after="0" w:line="252" w:lineRule="auto"/>
+            </w:pPr>
+            <w:r/>
+            <w:r>
+              <w:rPr>
+                <w:rFonts w:ascii="Consolas" w:hAnsi="Consolas" w:eastAsia="Consolas"/>
+                <w:color w:val="183B56"/>
+                <w:sz w:val="18"/>
+              </w:rPr>
+              <w:t>GET /api/briefing/tioman-demo</w:t>
+            </w:r>
+          </w:p>
+        </w:tc>
+        <w:tc>
+          <w:tcPr>
+            <w:tcW w:type="dxa" w:w="6660"/>
             <w:vAlign w:val="center"/>
             <w:tcMar>
               <w:top w:w="80" w:type="dxa"/>
@@ -1415,60 +1038,8 @@
                 <w:color w:val="243746"/>
                 <w:sz w:val="18"/>
               </w:rPr>
-              <w:t xml:space="preserve">Valid </w:t>
+              <w:t>200, safety wording present</w:t>
             </w:r>
-            <w:r>
-              <w:rPr>
-                <w:rFonts w:ascii="Consolas" w:hAnsi="Consolas" w:eastAsia="Consolas"/>
-                <w:color w:val="183B56"/>
-                <w:sz w:val="18"/>
-              </w:rPr>
-              <w:t>POST /api/observations</w:t>
-            </w:r>
-          </w:p>
-        </w:tc>
-        <w:tc>
-          <w:tcPr>
-            <w:tcW w:type="dxa" w:w="4010"/>
-            <w:vAlign w:val="center"/>
-            <w:tcMar>
-              <w:top w:w="80" w:type="dxa"/>
-              <w:start w:w="120" w:type="dxa"/>
-              <w:bottom w:w="80" w:type="dxa"/>
-              <w:end w:w="120" w:type="dxa"/>
-            </w:tcMar>
-          </w:tcPr>
-          <w:p>
-            <w:pPr>
-              <w:spacing w:before="0" w:after="0" w:line="252" w:lineRule="auto"/>
-            </w:pPr>
-            <w:r/>
-            <w:r>
-              <w:rPr>
-                <w:rFonts w:ascii="Calibri" w:hAnsi="Calibri" w:eastAsia="Calibri"/>
-                <w:color w:val="243746"/>
-                <w:sz w:val="18"/>
-              </w:rPr>
-              <w:t>HTTP 201; observation and derived fields are returned</w:t>
-            </w:r>
-          </w:p>
-        </w:tc>
-        <w:tc>
-          <w:tcPr>
-            <w:tcW w:type="dxa" w:w="3100"/>
-            <w:vAlign w:val="center"/>
-            <w:tcMar>
-              <w:top w:w="80" w:type="dxa"/>
-              <w:start w:w="120" w:type="dxa"/>
-              <w:bottom w:w="80" w:type="dxa"/>
-              <w:end w:w="120" w:type="dxa"/>
-            </w:tcMar>
-          </w:tcPr>
-          <w:p>
-            <w:pPr>
-              <w:spacing w:before="0" w:after="0" w:line="252" w:lineRule="auto"/>
-            </w:pPr>
-            <w:r/>
           </w:p>
         </w:tc>
       </w:tr>
@@ -1478,7 +1049,34 @@
         </w:trPr>
         <w:tc>
           <w:tcPr>
-            <w:tcW w:type="dxa" w:w="2250"/>
+            <w:tcW w:type="dxa" w:w="2700"/>
+            <w:vAlign w:val="center"/>
+            <w:tcMar>
+              <w:top w:w="80" w:type="dxa"/>
+              <w:start w:w="120" w:type="dxa"/>
+              <w:bottom w:w="80" w:type="dxa"/>
+              <w:end w:w="120" w:type="dxa"/>
+            </w:tcMar>
+            <w:shd w:fill="EFF3F7"/>
+          </w:tcPr>
+          <w:p>
+            <w:pPr>
+              <w:spacing w:before="0" w:after="0" w:line="252" w:lineRule="auto"/>
+            </w:pPr>
+            <w:r/>
+            <w:r>
+              <w:rPr>
+                <w:rFonts w:ascii="Consolas" w:hAnsi="Consolas" w:eastAsia="Consolas"/>
+                <w:color w:val="183B56"/>
+                <w:sz w:val="18"/>
+              </w:rPr>
+              <w:t>POST /api/profile</w:t>
+            </w:r>
+          </w:p>
+        </w:tc>
+        <w:tc>
+          <w:tcPr>
+            <w:tcW w:type="dxa" w:w="6660"/>
             <w:vAlign w:val="center"/>
             <w:tcMar>
               <w:top w:w="80" w:type="dxa"/>
@@ -1499,21 +1097,110 @@
                 <w:color w:val="243746"/>
                 <w:sz w:val="18"/>
               </w:rPr>
-              <w:t xml:space="preserve">Invalid </w:t>
+              <w:t>201, no PII fields</w:t>
             </w:r>
+          </w:p>
+        </w:tc>
+      </w:tr>
+      <w:tr>
+        <w:trPr>
+          <w:cantSplit/>
+        </w:trPr>
+        <w:tc>
+          <w:tcPr>
+            <w:tcW w:type="dxa" w:w="2700"/>
+            <w:vAlign w:val="center"/>
+            <w:tcMar>
+              <w:top w:w="80" w:type="dxa"/>
+              <w:start w:w="120" w:type="dxa"/>
+              <w:bottom w:w="80" w:type="dxa"/>
+              <w:end w:w="120" w:type="dxa"/>
+            </w:tcMar>
+          </w:tcPr>
+          <w:p>
+            <w:pPr>
+              <w:spacing w:before="0" w:after="0" w:line="252" w:lineRule="auto"/>
+            </w:pPr>
+            <w:r/>
             <w:r>
               <w:rPr>
                 <w:rFonts w:ascii="Consolas" w:hAnsi="Consolas" w:eastAsia="Consolas"/>
                 <w:color w:val="183B56"/>
                 <w:sz w:val="18"/>
               </w:rPr>
-              <w:t>POST /api/observations</w:t>
+              <w:t>POST /api/recognize</w:t>
+            </w:r>
+            <w:r>
+              <w:rPr>
+                <w:rFonts w:ascii="Calibri" w:hAnsi="Calibri" w:eastAsia="Calibri"/>
+                <w:color w:val="243746"/>
+                <w:sz w:val="18"/>
+              </w:rPr>
+              <w:t xml:space="preserve"> without provider</w:t>
             </w:r>
           </w:p>
         </w:tc>
         <w:tc>
           <w:tcPr>
-            <w:tcW w:type="dxa" w:w="4010"/>
+            <w:tcW w:type="dxa" w:w="6660"/>
+            <w:vAlign w:val="center"/>
+            <w:tcMar>
+              <w:top w:w="80" w:type="dxa"/>
+              <w:start w:w="120" w:type="dxa"/>
+              <w:bottom w:w="80" w:type="dxa"/>
+              <w:end w:w="120" w:type="dxa"/>
+            </w:tcMar>
+          </w:tcPr>
+          <w:p>
+            <w:pPr>
+              <w:spacing w:before="0" w:after="0" w:line="252" w:lineRule="auto"/>
+            </w:pPr>
+            <w:r/>
+            <w:r>
+              <w:rPr>
+                <w:rFonts w:ascii="Calibri" w:hAnsi="Calibri" w:eastAsia="Calibri"/>
+                <w:color w:val="243746"/>
+                <w:sz w:val="18"/>
+              </w:rPr>
+              <w:t>200, demo fallback and confirmation flag</w:t>
+            </w:r>
+          </w:p>
+        </w:tc>
+      </w:tr>
+      <w:tr>
+        <w:trPr>
+          <w:cantSplit/>
+        </w:trPr>
+        <w:tc>
+          <w:tcPr>
+            <w:tcW w:type="dxa" w:w="2700"/>
+            <w:vAlign w:val="center"/>
+            <w:tcMar>
+              <w:top w:w="80" w:type="dxa"/>
+              <w:start w:w="120" w:type="dxa"/>
+              <w:bottom w:w="80" w:type="dxa"/>
+              <w:end w:w="120" w:type="dxa"/>
+            </w:tcMar>
+            <w:shd w:fill="EFF3F7"/>
+          </w:tcPr>
+          <w:p>
+            <w:pPr>
+              <w:spacing w:before="0" w:after="0" w:line="252" w:lineRule="auto"/>
+            </w:pPr>
+            <w:r/>
+            <w:r>
+              <w:rPr>
+                <w:rFonts w:ascii="Consolas" w:hAnsi="Consolas" w:eastAsia="Consolas"/>
+                <w:color w:val="183B56"/>
+                <w:sz w:val="18"/>
+              </w:rPr>
+              <w:t>POST /api/sightings</w:t>
+            </w:r>
+          </w:p>
+        </w:tc>
+        <w:tc>
+          <w:tcPr>
+            <w:tcW w:type="dxa" w:w="6660"/>
             <w:vAlign w:val="center"/>
             <w:tcMar>
               <w:top w:w="80" w:type="dxa"/>
@@ -1534,27 +1221,8 @@
                 <w:color w:val="243746"/>
                 <w:sz w:val="18"/>
               </w:rPr>
-              <w:t>HTTP 400 with a safe, actionable validation message</w:t>
+              <w:t>201, site/species IDs only</w:t>
             </w:r>
-          </w:p>
-        </w:tc>
-        <w:tc>
-          <w:tcPr>
-            <w:tcW w:type="dxa" w:w="3100"/>
-            <w:vAlign w:val="center"/>
-            <w:tcMar>
-              <w:top w:w="80" w:type="dxa"/>
-              <w:start w:w="120" w:type="dxa"/>
-              <w:bottom w:w="80" w:type="dxa"/>
-              <w:end w:w="120" w:type="dxa"/>
-            </w:tcMar>
-            <w:shd w:fill="EFF3F7"/>
-          </w:tcPr>
-          <w:p>
-            <w:pPr>
-              <w:spacing w:before="0" w:after="0" w:line="252" w:lineRule="auto"/>
-            </w:pPr>
-            <w:r/>
           </w:p>
         </w:tc>
       </w:tr>
@@ -1564,7 +1232,7 @@
         </w:trPr>
         <w:tc>
           <w:tcPr>
-            <w:tcW w:type="dxa" w:w="2250"/>
+            <w:tcW w:type="dxa" w:w="2700"/>
             <w:vAlign w:val="center"/>
             <w:tcMar>
               <w:top w:w="80" w:type="dxa"/>
@@ -1584,21 +1252,13 @@
                 <w:color w:val="183B56"/>
                 <w:sz w:val="18"/>
               </w:rPr>
-              <w:t>GET /api/observations</w:t>
-            </w:r>
-            <w:r>
-              <w:rPr>
-                <w:rFonts w:ascii="Calibri" w:hAnsi="Calibri" w:eastAsia="Calibri"/>
-                <w:color w:val="243746"/>
-                <w:sz w:val="18"/>
-              </w:rPr>
-              <w:t xml:space="preserve"> after create</w:t>
+              <w:t>GET /api/sightings</w:t>
             </w:r>
           </w:p>
         </w:tc>
         <w:tc>
           <w:tcPr>
-            <w:tcW w:type="dxa" w:w="4010"/>
+            <w:tcW w:type="dxa" w:w="6660"/>
             <w:vAlign w:val="center"/>
             <w:tcMar>
               <w:top w:w="80" w:type="dxa"/>
@@ -1618,26 +1278,8 @@
                 <w:color w:val="243746"/>
                 <w:sz w:val="18"/>
               </w:rPr>
-              <w:t>The saved synthetic record is returned after refresh</w:t>
+              <w:t>200, no coordinates</w:t>
             </w:r>
-          </w:p>
-        </w:tc>
-        <w:tc>
-          <w:tcPr>
-            <w:tcW w:type="dxa" w:w="3100"/>
-            <w:vAlign w:val="center"/>
-            <w:tcMar>
-              <w:top w:w="80" w:type="dxa"/>
-              <w:start w:w="120" w:type="dxa"/>
-              <w:bottom w:w="80" w:type="dxa"/>
-              <w:end w:w="120" w:type="dxa"/>
-            </w:tcMar>
-          </w:tcPr>
-          <w:p>
-            <w:pPr>
-              <w:spacing w:before="0" w:after="0" w:line="252" w:lineRule="auto"/>
-            </w:pPr>
-            <w:r/>
           </w:p>
         </w:tc>
       </w:tr>
@@ -1647,7 +1289,34 @@
         </w:trPr>
         <w:tc>
           <w:tcPr>
-            <w:tcW w:type="dxa" w:w="2250"/>
+            <w:tcW w:type="dxa" w:w="2700"/>
+            <w:vAlign w:val="center"/>
+            <w:tcMar>
+              <w:top w:w="80" w:type="dxa"/>
+              <w:start w:w="120" w:type="dxa"/>
+              <w:bottom w:w="80" w:type="dxa"/>
+              <w:end w:w="120" w:type="dxa"/>
+            </w:tcMar>
+            <w:shd w:fill="EFF3F7"/>
+          </w:tcPr>
+          <w:p>
+            <w:pPr>
+              <w:spacing w:before="0" w:after="0" w:line="252" w:lineRule="auto"/>
+            </w:pPr>
+            <w:r/>
+            <w:r>
+              <w:rPr>
+                <w:rFonts w:ascii="Consolas" w:hAnsi="Consolas" w:eastAsia="Consolas"/>
+                <w:color w:val="183B56"/>
+                <w:sz w:val="18"/>
+              </w:rPr>
+              <w:t>GET /api/collection/divesafe-demo-diver</w:t>
+            </w:r>
+          </w:p>
+        </w:tc>
+        <w:tc>
+          <w:tcPr>
+            <w:tcW w:type="dxa" w:w="6660"/>
             <w:vAlign w:val="center"/>
             <w:tcMar>
               <w:top w:w="80" w:type="dxa"/>
@@ -1668,64 +1337,44 @@
                 <w:color w:val="243746"/>
                 <w:sz w:val="18"/>
               </w:rPr>
-              <w:t>Response privacy review</w:t>
+              <w:t>200, collection/badge response</w:t>
             </w:r>
-          </w:p>
-        </w:tc>
-        <w:tc>
-          <w:tcPr>
-            <w:tcW w:type="dxa" w:w="4010"/>
-            <w:vAlign w:val="center"/>
-            <w:tcMar>
-              <w:top w:w="80" w:type="dxa"/>
-              <w:start w:w="120" w:type="dxa"/>
-              <w:bottom w:w="80" w:type="dxa"/>
-              <w:end w:w="120" w:type="dxa"/>
-            </w:tcMar>
-            <w:shd w:fill="EFF3F7"/>
-          </w:tcPr>
-          <w:p>
-            <w:pPr>
-              <w:spacing w:before="0" w:after="0" w:line="252" w:lineRule="auto"/>
-            </w:pPr>
-            <w:r/>
-            <w:r>
-              <w:rPr>
-                <w:rFonts w:ascii="Calibri" w:hAnsi="Calibri" w:eastAsia="Calibri"/>
-                <w:color w:val="243746"/>
-                <w:sz w:val="18"/>
-              </w:rPr>
-              <w:t>No names, phone numbers, accounts, private locations, keys or connection strings</w:t>
-            </w:r>
-          </w:p>
-        </w:tc>
-        <w:tc>
-          <w:tcPr>
-            <w:tcW w:type="dxa" w:w="3100"/>
-            <w:vAlign w:val="center"/>
-            <w:tcMar>
-              <w:top w:w="80" w:type="dxa"/>
-              <w:start w:w="120" w:type="dxa"/>
-              <w:bottom w:w="80" w:type="dxa"/>
-              <w:end w:w="120" w:type="dxa"/>
-            </w:tcMar>
-            <w:shd w:fill="EFF3F7"/>
-          </w:tcPr>
-          <w:p>
-            <w:pPr>
-              <w:spacing w:before="0" w:after="0" w:line="252" w:lineRule="auto"/>
-            </w:pPr>
-            <w:r/>
           </w:p>
         </w:tc>
       </w:tr>
     </w:tbl>
     <w:p>
       <w:pPr>
+        <w:spacing w:before="0" w:after="120" w:line="264" w:lineRule="auto"/>
+      </w:pPr>
+      <w:r>
+        <w:rPr>
+          <w:rFonts w:ascii="Calibri" w:hAnsi="Calibri" w:eastAsia="Calibri"/>
+          <w:color w:val="243746"/>
+          <w:sz w:val="22"/>
+        </w:rPr>
+        <w:t>Reject names, phone numbers, emails, passwords, exact coordinates, unknown</w:t>
+      </w:r>
+    </w:p>
+    <w:p>
+      <w:pPr>
+        <w:spacing w:before="0" w:after="120" w:line="264" w:lineRule="auto"/>
+      </w:pPr>
+      <w:r>
+        <w:rPr>
+          <w:rFonts w:ascii="Calibri" w:hAnsi="Calibri" w:eastAsia="Calibri"/>
+          <w:color w:val="243746"/>
+          <w:sz w:val="22"/>
+        </w:rPr>
+        <w:t>sites/species and unsafe image URLs. Never show a provider key.</w:t>
+      </w:r>
+    </w:p>
+    <w:p>
+      <w:pPr>
         <w:pStyle w:val="Heading1"/>
       </w:pPr>
       <w:r>
-        <w:t>Accessibility and responsive checks</w:t>
+        <w:t>Release checks</w:t>
       </w:r>
     </w:p>
     <w:p>
@@ -1742,7 +1391,23 @@
           <w:color w:val="243746"/>
           <w:sz w:val="22"/>
         </w:rPr>
-        <w:t>Every input and control has a programmatic label.</w:t>
+        <w:t xml:space="preserve">Render points at the intended </w:t>
+      </w:r>
+      <w:r>
+        <w:rPr>
+          <w:rFonts w:ascii="Consolas" w:hAnsi="Consolas" w:eastAsia="Consolas"/>
+          <w:color w:val="183B56"/>
+          <w:sz w:val="20"/>
+        </w:rPr>
+        <w:t>main</w:t>
+      </w:r>
+      <w:r>
+        <w:rPr>
+          <w:rFonts w:ascii="Calibri" w:hAnsi="Calibri" w:eastAsia="Calibri"/>
+          <w:color w:val="243746"/>
+          <w:sz w:val="22"/>
+        </w:rPr>
+        <w:t xml:space="preserve"> commit.</w:t>
       </w:r>
     </w:p>
     <w:p>
@@ -1759,7 +1424,7 @@
           <w:color w:val="243746"/>
           <w:sz w:val="22"/>
         </w:rPr>
-        <w:t>Keyboard focus is visible and the full flow can be completed without a mouse.</w:t>
+        <w:t>PostgreSQL is private in Render; no connection string is in Git.</w:t>
       </w:r>
     </w:p>
     <w:p>
@@ -1776,7 +1441,7 @@
           <w:color w:val="243746"/>
           <w:sz w:val="22"/>
         </w:rPr>
-        <w:t>Error messages are announced near the field that needs correction.</w:t>
+        <w:t>No exact sensitive wildlife location is shown.</w:t>
       </w:r>
     </w:p>
     <w:p>
@@ -1793,7 +1458,7 @@
           <w:color w:val="243746"/>
           <w:sz w:val="22"/>
         </w:rPr>
-        <w:t>Status is explained with text or symbols and not by colour alone.</w:t>
+        <w:t>The old litter routes are not shown as the DiveSafe journey.</w:t>
       </w:r>
     </w:p>
     <w:p>
@@ -1810,7 +1475,7 @@
           <w:color w:val="243746"/>
           <w:sz w:val="22"/>
         </w:rPr>
-        <w:t>The map has an accessible list fallback containing equivalent context.</w:t>
+        <w:t>PPT and docs use the same routes, sources and limitations.</w:t>
       </w:r>
     </w:p>
     <w:p>
@@ -1827,286 +1492,7 @@
           <w:color w:val="243746"/>
           <w:sz w:val="22"/>
         </w:rPr>
-        <w:t>The 375 px layout has no horizontal overflow or clipped controls.</w:t>
-      </w:r>
-    </w:p>
-    <w:p>
-      <w:pPr>
-        <w:spacing w:before="0" w:after="80" w:line="280" w:lineRule="auto"/>
-        <w:numPr>
-          <w:ilvl w:val="0"/>
-          <w:numId w:val="11"/>
-        </w:numPr>
-      </w:pPr>
-      <w:r>
-        <w:rPr>
-          <w:rFonts w:ascii="Calibri" w:hAnsi="Calibri" w:eastAsia="Calibri"/>
-          <w:color w:val="243746"/>
-          <w:sz w:val="22"/>
-        </w:rPr>
-        <w:t>Zoom at 200% keeps content readable and actions available.</w:t>
-      </w:r>
-    </w:p>
-    <w:p>
-      <w:pPr>
-        <w:spacing w:before="0" w:after="80" w:line="280" w:lineRule="auto"/>
-        <w:numPr>
-          <w:ilvl w:val="0"/>
-          <w:numId w:val="11"/>
-        </w:numPr>
-      </w:pPr>
-      <w:r>
-        <w:rPr>
-          <w:rFonts w:ascii="Calibri" w:hAnsi="Calibri" w:eastAsia="Calibri"/>
-          <w:color w:val="243746"/>
-          <w:sz w:val="22"/>
-        </w:rPr>
-        <w:t>Headings, landmarks and reading order are logical.</w:t>
-      </w:r>
-    </w:p>
-    <w:p>
-      <w:pPr>
-        <w:pStyle w:val="Heading1"/>
-      </w:pPr>
-      <w:r>
-        <w:t>Data, safety and interpretation checks</w:t>
-      </w:r>
-    </w:p>
-    <w:p>
-      <w:pPr>
-        <w:spacing w:before="0" w:after="80" w:line="280" w:lineRule="auto"/>
-        <w:numPr>
-          <w:ilvl w:val="0"/>
-          <w:numId w:val="11"/>
-        </w:numPr>
-      </w:pPr>
-      <w:r>
-        <w:rPr>
-          <w:rFonts w:ascii="Calibri" w:hAnsi="Calibri" w:eastAsia="Calibri"/>
-          <w:color w:val="243746"/>
-          <w:sz w:val="22"/>
-        </w:rPr>
-        <w:t>All entered observation data is synthetic and contains no personal identifiers.</w:t>
-      </w:r>
-    </w:p>
-    <w:p>
-      <w:pPr>
-        <w:spacing w:before="0" w:after="80" w:line="280" w:lineRule="auto"/>
-        <w:numPr>
-          <w:ilvl w:val="0"/>
-          <w:numId w:val="11"/>
-        </w:numPr>
-      </w:pPr>
-      <w:r>
-        <w:rPr>
-          <w:rFonts w:ascii="Calibri" w:hAnsi="Calibri" w:eastAsia="Calibri"/>
-          <w:color w:val="243746"/>
-          <w:sz w:val="22"/>
-        </w:rPr>
-        <w:t>OBIS context displays source and version information.</w:t>
-      </w:r>
-    </w:p>
-    <w:p>
-      <w:pPr>
-        <w:spacing w:before="0" w:after="80" w:line="280" w:lineRule="auto"/>
-        <w:numPr>
-          <w:ilvl w:val="0"/>
-          <w:numId w:val="11"/>
-        </w:numPr>
-      </w:pPr>
-      <w:r>
-        <w:rPr>
-          <w:rFonts w:ascii="Calibri" w:hAnsi="Calibri" w:eastAsia="Calibri"/>
-          <w:color w:val="243746"/>
-          <w:sz w:val="22"/>
-        </w:rPr>
-        <w:t>Exact sensitive species locations are not exposed.</w:t>
-      </w:r>
-    </w:p>
-    <w:p>
-      <w:pPr>
-        <w:spacing w:before="0" w:after="80" w:line="280" w:lineRule="auto"/>
-        <w:numPr>
-          <w:ilvl w:val="0"/>
-          <w:numId w:val="11"/>
-        </w:numPr>
-      </w:pPr>
-      <w:r>
-        <w:rPr>
-          <w:rFonts w:ascii="Calibri" w:hAnsi="Calibri" w:eastAsia="Calibri"/>
-          <w:color w:val="243746"/>
-          <w:sz w:val="22"/>
-        </w:rPr>
-        <w:t>Category and priority wording is clearly illustrative and rule-based.</w:t>
-      </w:r>
-    </w:p>
-    <w:p>
-      <w:pPr>
-        <w:spacing w:before="0" w:after="80" w:line="280" w:lineRule="auto"/>
-        <w:numPr>
-          <w:ilvl w:val="0"/>
-          <w:numId w:val="11"/>
-        </w:numPr>
-      </w:pPr>
-      <w:r>
-        <w:rPr>
-          <w:rFonts w:ascii="Calibri" w:hAnsi="Calibri" w:eastAsia="Calibri"/>
-          <w:color w:val="243746"/>
-          <w:sz w:val="22"/>
-        </w:rPr>
-        <w:t>No screen claims to prove a pollution source, species identity or ecological impact.</w:t>
-      </w:r>
-    </w:p>
-    <w:p>
-      <w:pPr>
-        <w:spacing w:before="0" w:after="80" w:line="280" w:lineRule="auto"/>
-        <w:numPr>
-          <w:ilvl w:val="0"/>
-          <w:numId w:val="11"/>
-        </w:numPr>
-      </w:pPr>
-      <w:r>
-        <w:rPr>
-          <w:rFonts w:ascii="Calibri" w:hAnsi="Calibri" w:eastAsia="Calibri"/>
-          <w:color w:val="243746"/>
-          <w:sz w:val="22"/>
-        </w:rPr>
-        <w:t>No screen directs enforcement or presents an official clean-up priority.</w:t>
-      </w:r>
-    </w:p>
-    <w:p>
-      <w:pPr>
-        <w:spacing w:before="0" w:after="80" w:line="280" w:lineRule="auto"/>
-        <w:numPr>
-          <w:ilvl w:val="0"/>
-          <w:numId w:val="11"/>
-        </w:numPr>
-      </w:pPr>
-      <w:r>
-        <w:rPr>
-          <w:rFonts w:ascii="Calibri" w:hAnsi="Calibri" w:eastAsia="Calibri"/>
-          <w:color w:val="243746"/>
-          <w:sz w:val="22"/>
-        </w:rPr>
-        <w:t>External AI, computer vision and real raw-file upload remain disabled.</w:t>
-      </w:r>
-    </w:p>
-    <w:p>
-      <w:pPr>
-        <w:pStyle w:val="Heading1"/>
-      </w:pPr>
-      <w:r>
-        <w:t>Deployment and evidence checks</w:t>
-      </w:r>
-    </w:p>
-    <w:p>
-      <w:pPr>
-        <w:spacing w:before="0" w:after="80" w:line="280" w:lineRule="auto"/>
-        <w:numPr>
-          <w:ilvl w:val="0"/>
-          <w:numId w:val="11"/>
-        </w:numPr>
-      </w:pPr>
-      <w:r>
-        <w:rPr>
-          <w:rFonts w:ascii="Calibri" w:hAnsi="Calibri" w:eastAsia="Calibri"/>
-          <w:color w:val="243746"/>
-          <w:sz w:val="22"/>
-        </w:rPr>
-        <w:t>The frontend calls the intended Render API URL.</w:t>
-      </w:r>
-    </w:p>
-    <w:p>
-      <w:pPr>
-        <w:spacing w:before="0" w:after="80" w:line="280" w:lineRule="auto"/>
-        <w:numPr>
-          <w:ilvl w:val="0"/>
-          <w:numId w:val="11"/>
-        </w:numPr>
-      </w:pPr>
-      <w:r>
-        <w:rPr>
-          <w:rFonts w:ascii="Calibri" w:hAnsi="Calibri" w:eastAsia="Calibri"/>
-          <w:color w:val="243746"/>
-          <w:sz w:val="22"/>
-        </w:rPr>
-        <w:t>Both services use HTTPS and no mixed-content error appears.</w:t>
-      </w:r>
-    </w:p>
-    <w:p>
-      <w:pPr>
-        <w:spacing w:before="0" w:after="80" w:line="280" w:lineRule="auto"/>
-        <w:numPr>
-          <w:ilvl w:val="0"/>
-          <w:numId w:val="11"/>
-        </w:numPr>
-      </w:pPr>
-      <w:r>
-        <w:rPr>
-          <w:rFonts w:ascii="Calibri" w:hAnsi="Calibri" w:eastAsia="Calibri"/>
-          <w:color w:val="243746"/>
-          <w:sz w:val="22"/>
-        </w:rPr>
-        <w:t>A cold-start or temporary API delay produces a recoverable experience.</w:t>
-      </w:r>
-    </w:p>
-    <w:p>
-      <w:pPr>
-        <w:spacing w:before="0" w:after="80" w:line="280" w:lineRule="auto"/>
-        <w:numPr>
-          <w:ilvl w:val="0"/>
-          <w:numId w:val="11"/>
-        </w:numPr>
-      </w:pPr>
-      <w:r>
-        <w:rPr>
-          <w:rFonts w:ascii="Calibri" w:hAnsi="Calibri" w:eastAsia="Calibri"/>
-          <w:color w:val="243746"/>
-          <w:sz w:val="22"/>
-        </w:rPr>
-        <w:t>One screenshot shows the completed result and visible boundary wording.</w:t>
-      </w:r>
-    </w:p>
-    <w:p>
-      <w:pPr>
-        <w:spacing w:before="0" w:after="80" w:line="280" w:lineRule="auto"/>
-        <w:numPr>
-          <w:ilvl w:val="0"/>
-          <w:numId w:val="11"/>
-        </w:numPr>
-      </w:pPr>
-      <w:r>
-        <w:rPr>
-          <w:rFonts w:ascii="Calibri" w:hAnsi="Calibri" w:eastAsia="Calibri"/>
-          <w:color w:val="243746"/>
-          <w:sz w:val="22"/>
-        </w:rPr>
-        <w:t>The PGP records commit, test time, URLs, synthetic inputs, response status and known limitations.</w:t>
-      </w:r>
-    </w:p>
-    <w:p>
-      <w:pPr>
-        <w:spacing w:before="0" w:after="80" w:line="280" w:lineRule="auto"/>
-        <w:numPr>
-          <w:ilvl w:val="0"/>
-          <w:numId w:val="11"/>
-        </w:numPr>
-      </w:pPr>
-      <w:r>
-        <w:rPr>
-          <w:rFonts w:ascii="Calibri" w:hAnsi="Calibri" w:eastAsia="Calibri"/>
-          <w:color w:val="243746"/>
-          <w:sz w:val="22"/>
-        </w:rPr>
-        <w:t>The release owner records any failed item with an owner and next action.</w:t>
-      </w:r>
-    </w:p>
-    <w:p>
-      <w:pPr>
-        <w:pStyle w:val="Heading1"/>
-      </w:pPr>
-      <w:r>
-        <w:t>Known limitations to disclose</w:t>
+        <w:t>PGP records time, commit, screenshots, response status and open issues.</w:t>
       </w:r>
     </w:p>
     <w:p>
@@ -2119,108 +1505,21 @@
           <w:color w:val="243746"/>
           <w:sz w:val="22"/>
         </w:rPr>
-        <w:t>The first release uses a static OBIS sample and deterministic illustrative rules. It does not provide real-time monitoring, verified species identification, pollution-source attribution, ecological assessment, automated clean-up scheduling or enforcement support. Passing this checklist supports a course demonstration, not production readiness.</w:t>
-      </w:r>
-    </w:p>
-    <w:p>
-      <w:pPr>
-        <w:pStyle w:val="Heading1"/>
-      </w:pPr>
-      <w:r>
-        <w:t>Project spaces</w:t>
+        <w:t>Passing this list supports a course demo only. It does not support a real</w:t>
       </w:r>
     </w:p>
     <w:p>
       <w:pPr>
         <w:spacing w:before="0" w:after="120" w:line="264" w:lineRule="auto"/>
       </w:pPr>
-      <w:hyperlink r:id="rId13">
-        <w:r>
-          <w:rPr>
-            <w:rFonts w:ascii="Calibri" w:hAnsi="Calibri"/>
-            <w:color w:val="0563C1"/>
-            <w:u w:val="single"/>
-            <w:sz w:val="22"/>
-          </w:rPr>
-          <w:t>GitHub</w:t>
-        </w:r>
-      </w:hyperlink>
       <w:r>
         <w:rPr>
           <w:rFonts w:ascii="Calibri" w:hAnsi="Calibri" w:eastAsia="Calibri"/>
           <w:color w:val="243746"/>
           <w:sz w:val="22"/>
         </w:rPr>
-        <w:t xml:space="preserve"> | </w:t>
+        <w:t>survey, species claim, permit decision or enforcement action.</w:t>
       </w:r>
-      <w:hyperlink r:id="rId11">
-        <w:r>
-          <w:rPr>
-            <w:rFonts w:ascii="Calibri" w:hAnsi="Calibri"/>
-            <w:color w:val="0563C1"/>
-            <w:u w:val="single"/>
-            <w:sz w:val="22"/>
-          </w:rPr>
-          <w:t>Render frontend</w:t>
-        </w:r>
-      </w:hyperlink>
-      <w:r>
-        <w:rPr>
-          <w:rFonts w:ascii="Calibri" w:hAnsi="Calibri" w:eastAsia="Calibri"/>
-          <w:color w:val="243746"/>
-          <w:sz w:val="22"/>
-        </w:rPr>
-        <w:t xml:space="preserve"> | </w:t>
-      </w:r>
-      <w:hyperlink r:id="rId12">
-        <w:r>
-          <w:rPr>
-            <w:rFonts w:ascii="Calibri" w:hAnsi="Calibri"/>
-            <w:color w:val="0563C1"/>
-            <w:u w:val="single"/>
-            <w:sz w:val="22"/>
-          </w:rPr>
-          <w:t>Render API</w:t>
-        </w:r>
-      </w:hyperlink>
-      <w:r>
-        <w:rPr>
-          <w:rFonts w:ascii="Calibri" w:hAnsi="Calibri" w:eastAsia="Calibri"/>
-          <w:color w:val="243746"/>
-          <w:sz w:val="22"/>
-        </w:rPr>
-        <w:t xml:space="preserve"> | </w:t>
-      </w:r>
-      <w:hyperlink r:id="rId14">
-        <w:r>
-          <w:rPr>
-            <w:rFonts w:ascii="Calibri" w:hAnsi="Calibri"/>
-            <w:color w:val="0563C1"/>
-            <w:u w:val="single"/>
-            <w:sz w:val="22"/>
-          </w:rPr>
-          <w:t>Drive PGP</w:t>
-        </w:r>
-      </w:hyperlink>
-      <w:r>
-        <w:rPr>
-          <w:rFonts w:ascii="Calibri" w:hAnsi="Calibri" w:eastAsia="Calibri"/>
-          <w:color w:val="243746"/>
-          <w:sz w:val="22"/>
-        </w:rPr>
-        <w:t xml:space="preserve"> | </w:t>
-      </w:r>
-      <w:hyperlink r:id="rId15">
-        <w:r>
-          <w:rPr>
-            <w:rFonts w:ascii="Calibri" w:hAnsi="Calibri"/>
-            <w:color w:val="0563C1"/>
-            <w:u w:val="single"/>
-            <w:sz w:val="22"/>
-          </w:rPr>
-          <w:t>Miro</w:t>
-        </w:r>
-      </w:hyperlink>
     </w:p>
     <w:sectPr>
       <w:headerReference w:type="default" r:id="rId9"/>
@@ -2250,7 +1549,7 @@
         <w:color w:val="61737C"/>
         <w:sz w:val="16"/>
       </w:rPr>
-      <w:t>VERSION 1.0 | 14 AUGUST 2026 | SYNTHETIC/PUBLIC DATA | NON-ENFORCEMENT DEMO</w:t>
+      <w:t>VERSION 2.0 | 15 AUGUST 2026 | SYNTHETIC/PUBLIC DATA | NON-ENFORCEMENT DEMO</w:t>
     </w:r>
     <w:r>
       <w:rPr>
@@ -2292,7 +1591,7 @@
         <w:color w:val="0F6F73"/>
         <w:sz w:val="16"/>
       </w:rPr>
-      <w:t>TEAM 04 | MARINE OBSERVATION MVP</w:t>
+      <w:t>TEAM 04 | DIVESAFE MY</w:t>
     </w:r>
   </w:p>
 </w:hdr>

</xml_diff>